<commit_message>
Update logbook with week 7 and 10 lab results
</commit_message>
<xml_diff>
--- a/LABlogbook.docx
+++ b/LABlogbook.docx
@@ -140,7 +140,7 @@
         </w:rPr>
         <w:lastRenderedPageBreak/>
         <w:drawing>
-          <wp:inline distT="0" distB="0" distL="0" distR="0" wp14:anchorId="78F0B1E5" wp14:editId="18ED8BDA">
+          <wp:inline distT="0" distB="0" distL="0" distR="0" wp14:anchorId="78F0B1E5" wp14:editId="6DB66435">
             <wp:extent cx="5868365" cy="5579694"/>
             <wp:effectExtent l="0" t="0" r="0" b="0"/>
             <wp:docPr id="487666157" name="Picture 1" descr="A screenshot of a computer program&#10;&#10;AI-generated content may be incorrect."/>
@@ -218,7 +218,7 @@
         </w:rPr>
         <w:lastRenderedPageBreak/>
         <w:drawing>
-          <wp:inline distT="0" distB="0" distL="0" distR="0" wp14:anchorId="1D626FE9" wp14:editId="5CA3F4A7">
+          <wp:inline distT="0" distB="0" distL="0" distR="0" wp14:anchorId="1D626FE9" wp14:editId="7C6C9C55">
             <wp:extent cx="4699322" cy="4891960"/>
             <wp:effectExtent l="0" t="0" r="0" b="0"/>
             <wp:docPr id="1334260156" name="Picture 2" descr="A screenshot of a computer program&#10;&#10;AI-generated content may be incorrect."/>
@@ -404,7 +404,7 @@
           <w:u w:val="single"/>
         </w:rPr>
         <w:drawing>
-          <wp:inline distT="0" distB="0" distL="0" distR="0" wp14:anchorId="68F8CF3A" wp14:editId="277C0A4D">
+          <wp:inline distT="0" distB="0" distL="0" distR="0" wp14:anchorId="68F8CF3A" wp14:editId="05612F9F">
             <wp:extent cx="5731510" cy="3455035"/>
             <wp:effectExtent l="0" t="0" r="0" b="0"/>
             <wp:docPr id="1779173969" name="Picture 1" descr="A screenshot of a computer&#10;&#10;AI-generated content may be incorrect."/>
@@ -683,7 +683,7 @@
           <w:noProof/>
         </w:rPr>
         <w:drawing>
-          <wp:inline distT="0" distB="0" distL="0" distR="0" wp14:anchorId="0CC855C4" wp14:editId="414C4EE9">
+          <wp:inline distT="0" distB="0" distL="0" distR="0" wp14:anchorId="0CC855C4" wp14:editId="4B1BD257">
             <wp:extent cx="5731510" cy="4110355"/>
             <wp:effectExtent l="0" t="0" r="0" b="4445"/>
             <wp:docPr id="427495545" name="Picture 1" descr="A screenshot of a computer program&#10;&#10;AI-generated content may be incorrect."/>
@@ -812,6 +812,194 @@
           <w:u w:val="single"/>
         </w:rPr>
       </w:pPr>
+      <w:r>
+        <w:rPr>
+          <w:noProof/>
+          <w:sz w:val="44"/>
+          <w:szCs w:val="44"/>
+          <w:u w:val="single"/>
+        </w:rPr>
+        <w:drawing>
+          <wp:inline distT="0" distB="0" distL="0" distR="0" wp14:anchorId="2FBBD557" wp14:editId="47F63353">
+            <wp:extent cx="5731510" cy="3717290"/>
+            <wp:effectExtent l="0" t="0" r="0" b="3810"/>
+            <wp:docPr id="2013889918" name="Picture 4" descr="A screenshot of a computer&#10;&#10;AI-generated content may be incorrect."/>
+            <wp:cNvGraphicFramePr>
+              <a:graphicFrameLocks xmlns:a="http://schemas.openxmlformats.org/drawingml/2006/main" noChangeAspect="1"/>
+            </wp:cNvGraphicFramePr>
+            <a:graphic xmlns:a="http://schemas.openxmlformats.org/drawingml/2006/main">
+              <a:graphicData uri="http://schemas.openxmlformats.org/drawingml/2006/picture">
+                <pic:pic xmlns:pic="http://schemas.openxmlformats.org/drawingml/2006/picture">
+                  <pic:nvPicPr>
+                    <pic:cNvPr id="2013889918" name="Picture 4" descr="A screenshot of a computer&#10;&#10;AI-generated content may be incorrect."/>
+                    <pic:cNvPicPr/>
+                  </pic:nvPicPr>
+                  <pic:blipFill>
+                    <a:blip r:embed="rId14" cstate="print">
+                      <a:extLst>
+                        <a:ext uri="{28A0092B-C50C-407E-A947-70E740481C1C}">
+                          <a14:useLocalDpi xmlns:a14="http://schemas.microsoft.com/office/drawing/2010/main" val="0"/>
+                        </a:ext>
+                      </a:extLst>
+                    </a:blip>
+                    <a:stretch>
+                      <a:fillRect/>
+                    </a:stretch>
+                  </pic:blipFill>
+                  <pic:spPr>
+                    <a:xfrm>
+                      <a:off x="0" y="0"/>
+                      <a:ext cx="5731510" cy="3717290"/>
+                    </a:xfrm>
+                    <a:prstGeom prst="rect">
+                      <a:avLst/>
+                    </a:prstGeom>
+                  </pic:spPr>
+                </pic:pic>
+              </a:graphicData>
+            </a:graphic>
+          </wp:inline>
+        </w:drawing>
+      </w:r>
+    </w:p>
+    <w:p>
+      <w:pPr>
+        <w:jc w:val="both"/>
+        <w:rPr>
+          <w:sz w:val="44"/>
+          <w:szCs w:val="44"/>
+          <w:u w:val="single"/>
+        </w:rPr>
+      </w:pPr>
+    </w:p>
+    <w:p>
+      <w:pPr>
+        <w:jc w:val="both"/>
+        <w:rPr>
+          <w:sz w:val="44"/>
+          <w:szCs w:val="44"/>
+          <w:u w:val="single"/>
+        </w:rPr>
+      </w:pPr>
+      <w:r>
+        <w:rPr>
+          <w:noProof/>
+          <w:sz w:val="44"/>
+          <w:szCs w:val="44"/>
+          <w:u w:val="single"/>
+        </w:rPr>
+        <w:lastRenderedPageBreak/>
+        <w:drawing>
+          <wp:inline distT="0" distB="0" distL="0" distR="0" wp14:anchorId="2B06B7D9" wp14:editId="395D363A">
+            <wp:extent cx="5731510" cy="2881630"/>
+            <wp:effectExtent l="0" t="0" r="0" b="1270"/>
+            <wp:docPr id="2002228295" name="Picture 5" descr="A screenshot of a computer code&#10;&#10;AI-generated content may be incorrect."/>
+            <wp:cNvGraphicFramePr>
+              <a:graphicFrameLocks xmlns:a="http://schemas.openxmlformats.org/drawingml/2006/main" noChangeAspect="1"/>
+            </wp:cNvGraphicFramePr>
+            <a:graphic xmlns:a="http://schemas.openxmlformats.org/drawingml/2006/main">
+              <a:graphicData uri="http://schemas.openxmlformats.org/drawingml/2006/picture">
+                <pic:pic xmlns:pic="http://schemas.openxmlformats.org/drawingml/2006/picture">
+                  <pic:nvPicPr>
+                    <pic:cNvPr id="2002228295" name="Picture 5" descr="A screenshot of a computer code&#10;&#10;AI-generated content may be incorrect."/>
+                    <pic:cNvPicPr/>
+                  </pic:nvPicPr>
+                  <pic:blipFill>
+                    <a:blip r:embed="rId15" cstate="print">
+                      <a:extLst>
+                        <a:ext uri="{28A0092B-C50C-407E-A947-70E740481C1C}">
+                          <a14:useLocalDpi xmlns:a14="http://schemas.microsoft.com/office/drawing/2010/main" val="0"/>
+                        </a:ext>
+                      </a:extLst>
+                    </a:blip>
+                    <a:stretch>
+                      <a:fillRect/>
+                    </a:stretch>
+                  </pic:blipFill>
+                  <pic:spPr>
+                    <a:xfrm>
+                      <a:off x="0" y="0"/>
+                      <a:ext cx="5731510" cy="2881630"/>
+                    </a:xfrm>
+                    <a:prstGeom prst="rect">
+                      <a:avLst/>
+                    </a:prstGeom>
+                  </pic:spPr>
+                </pic:pic>
+              </a:graphicData>
+            </a:graphic>
+          </wp:inline>
+        </w:drawing>
+      </w:r>
+    </w:p>
+    <w:p>
+      <w:pPr>
+        <w:jc w:val="both"/>
+        <w:rPr>
+          <w:sz w:val="44"/>
+          <w:szCs w:val="44"/>
+          <w:u w:val="single"/>
+        </w:rPr>
+      </w:pPr>
+      <w:r>
+        <w:rPr>
+          <w:noProof/>
+          <w:sz w:val="44"/>
+          <w:szCs w:val="44"/>
+          <w:u w:val="single"/>
+        </w:rPr>
+        <w:drawing>
+          <wp:inline distT="0" distB="0" distL="0" distR="0" wp14:anchorId="32D67E92" wp14:editId="3F4E4942">
+            <wp:extent cx="5731510" cy="2113280"/>
+            <wp:effectExtent l="0" t="0" r="0" b="0"/>
+            <wp:docPr id="1333130594" name="Picture 6" descr="A graph with blue and orange lines&#10;&#10;AI-generated content may be incorrect."/>
+            <wp:cNvGraphicFramePr>
+              <a:graphicFrameLocks xmlns:a="http://schemas.openxmlformats.org/drawingml/2006/main" noChangeAspect="1"/>
+            </wp:cNvGraphicFramePr>
+            <a:graphic xmlns:a="http://schemas.openxmlformats.org/drawingml/2006/main">
+              <a:graphicData uri="http://schemas.openxmlformats.org/drawingml/2006/picture">
+                <pic:pic xmlns:pic="http://schemas.openxmlformats.org/drawingml/2006/picture">
+                  <pic:nvPicPr>
+                    <pic:cNvPr id="1333130594" name="Picture 6" descr="A graph with blue and orange lines&#10;&#10;AI-generated content may be incorrect."/>
+                    <pic:cNvPicPr/>
+                  </pic:nvPicPr>
+                  <pic:blipFill>
+                    <a:blip r:embed="rId16" cstate="print">
+                      <a:extLst>
+                        <a:ext uri="{28A0092B-C50C-407E-A947-70E740481C1C}">
+                          <a14:useLocalDpi xmlns:a14="http://schemas.microsoft.com/office/drawing/2010/main" val="0"/>
+                        </a:ext>
+                      </a:extLst>
+                    </a:blip>
+                    <a:stretch>
+                      <a:fillRect/>
+                    </a:stretch>
+                  </pic:blipFill>
+                  <pic:spPr>
+                    <a:xfrm>
+                      <a:off x="0" y="0"/>
+                      <a:ext cx="5731510" cy="2113280"/>
+                    </a:xfrm>
+                    <a:prstGeom prst="rect">
+                      <a:avLst/>
+                    </a:prstGeom>
+                  </pic:spPr>
+                </pic:pic>
+              </a:graphicData>
+            </a:graphic>
+          </wp:inline>
+        </w:drawing>
+      </w:r>
+    </w:p>
+    <w:p>
+      <w:pPr>
+        <w:jc w:val="both"/>
+        <w:rPr>
+          <w:sz w:val="44"/>
+          <w:szCs w:val="44"/>
+          <w:u w:val="single"/>
+        </w:rPr>
+      </w:pPr>
     </w:p>
     <w:p>
       <w:pPr>
@@ -850,12 +1038,53 @@
           <w:u w:val="single"/>
         </w:rPr>
       </w:pPr>
-      <w:r>
-        <w:rPr>
-          <w:sz w:val="44"/>
-          <w:szCs w:val="44"/>
-          <w:u w:val="single"/>
-        </w:rPr>
+    </w:p>
+    <w:p>
+      <w:pPr>
+        <w:jc w:val="both"/>
+        <w:rPr>
+          <w:sz w:val="44"/>
+          <w:szCs w:val="44"/>
+          <w:u w:val="single"/>
+        </w:rPr>
+      </w:pPr>
+    </w:p>
+    <w:p>
+      <w:pPr>
+        <w:jc w:val="both"/>
+        <w:rPr>
+          <w:sz w:val="44"/>
+          <w:szCs w:val="44"/>
+          <w:u w:val="single"/>
+        </w:rPr>
+      </w:pPr>
+    </w:p>
+    <w:p>
+      <w:pPr>
+        <w:jc w:val="both"/>
+        <w:rPr>
+          <w:sz w:val="44"/>
+          <w:szCs w:val="44"/>
+          <w:u w:val="single"/>
+        </w:rPr>
+      </w:pPr>
+    </w:p>
+    <w:p>
+      <w:pPr>
+        <w:jc w:val="both"/>
+        <w:rPr>
+          <w:sz w:val="44"/>
+          <w:szCs w:val="44"/>
+          <w:u w:val="single"/>
+        </w:rPr>
+      </w:pPr>
+      <w:r>
+        <w:rPr>
+          <w:sz w:val="44"/>
+          <w:szCs w:val="44"/>
+          <w:u w:val="single"/>
+        </w:rPr>
+        <w:lastRenderedPageBreak/>
         <w:t xml:space="preserve">Lab 9 </w:t>
       </w:r>
     </w:p>
@@ -896,6 +1125,343 @@
           <w:u w:val="single"/>
         </w:rPr>
       </w:pPr>
+      <w:r>
+        <w:rPr>
+          <w:noProof/>
+          <w:sz w:val="44"/>
+          <w:szCs w:val="44"/>
+          <w:u w:val="single"/>
+        </w:rPr>
+        <w:drawing>
+          <wp:inline distT="0" distB="0" distL="0" distR="0" wp14:anchorId="49C2E09F" wp14:editId="4F4CEB25">
+            <wp:extent cx="5731510" cy="5094605"/>
+            <wp:effectExtent l="0" t="0" r="0" b="0"/>
+            <wp:docPr id="933085977" name="Picture 14" descr="A screenshot of a computer program&#10;&#10;AI-generated content may be incorrect."/>
+            <wp:cNvGraphicFramePr>
+              <a:graphicFrameLocks xmlns:a="http://schemas.openxmlformats.org/drawingml/2006/main" noChangeAspect="1"/>
+            </wp:cNvGraphicFramePr>
+            <a:graphic xmlns:a="http://schemas.openxmlformats.org/drawingml/2006/main">
+              <a:graphicData uri="http://schemas.openxmlformats.org/drawingml/2006/picture">
+                <pic:pic xmlns:pic="http://schemas.openxmlformats.org/drawingml/2006/picture">
+                  <pic:nvPicPr>
+                    <pic:cNvPr id="933085977" name="Picture 14" descr="A screenshot of a computer program&#10;&#10;AI-generated content may be incorrect."/>
+                    <pic:cNvPicPr/>
+                  </pic:nvPicPr>
+                  <pic:blipFill>
+                    <a:blip r:embed="rId17" cstate="print">
+                      <a:extLst>
+                        <a:ext uri="{28A0092B-C50C-407E-A947-70E740481C1C}">
+                          <a14:useLocalDpi xmlns:a14="http://schemas.microsoft.com/office/drawing/2010/main" val="0"/>
+                        </a:ext>
+                      </a:extLst>
+                    </a:blip>
+                    <a:stretch>
+                      <a:fillRect/>
+                    </a:stretch>
+                  </pic:blipFill>
+                  <pic:spPr>
+                    <a:xfrm>
+                      <a:off x="0" y="0"/>
+                      <a:ext cx="5731510" cy="5094605"/>
+                    </a:xfrm>
+                    <a:prstGeom prst="rect">
+                      <a:avLst/>
+                    </a:prstGeom>
+                  </pic:spPr>
+                </pic:pic>
+              </a:graphicData>
+            </a:graphic>
+          </wp:inline>
+        </w:drawing>
+      </w:r>
+    </w:p>
+    <w:p>
+      <w:pPr>
+        <w:jc w:val="both"/>
+        <w:rPr>
+          <w:sz w:val="44"/>
+          <w:szCs w:val="44"/>
+          <w:u w:val="single"/>
+        </w:rPr>
+      </w:pPr>
+      <w:r>
+        <w:rPr>
+          <w:noProof/>
+          <w:sz w:val="44"/>
+          <w:szCs w:val="44"/>
+          <w:u w:val="single"/>
+        </w:rPr>
+        <w:lastRenderedPageBreak/>
+        <w:drawing>
+          <wp:inline distT="0" distB="0" distL="0" distR="0" wp14:anchorId="00EEDDBA" wp14:editId="26DB8A14">
+            <wp:extent cx="5731510" cy="4947920"/>
+            <wp:effectExtent l="0" t="0" r="0" b="5080"/>
+            <wp:docPr id="1420891525" name="Picture 12" descr="A screenshot of a computer program&#10;&#10;AI-generated content may be incorrect."/>
+            <wp:cNvGraphicFramePr>
+              <a:graphicFrameLocks xmlns:a="http://schemas.openxmlformats.org/drawingml/2006/main" noChangeAspect="1"/>
+            </wp:cNvGraphicFramePr>
+            <a:graphic xmlns:a="http://schemas.openxmlformats.org/drawingml/2006/main">
+              <a:graphicData uri="http://schemas.openxmlformats.org/drawingml/2006/picture">
+                <pic:pic xmlns:pic="http://schemas.openxmlformats.org/drawingml/2006/picture">
+                  <pic:nvPicPr>
+                    <pic:cNvPr id="1420891525" name="Picture 12" descr="A screenshot of a computer program&#10;&#10;AI-generated content may be incorrect."/>
+                    <pic:cNvPicPr/>
+                  </pic:nvPicPr>
+                  <pic:blipFill>
+                    <a:blip r:embed="rId18" cstate="print">
+                      <a:extLst>
+                        <a:ext uri="{28A0092B-C50C-407E-A947-70E740481C1C}">
+                          <a14:useLocalDpi xmlns:a14="http://schemas.microsoft.com/office/drawing/2010/main" val="0"/>
+                        </a:ext>
+                      </a:extLst>
+                    </a:blip>
+                    <a:stretch>
+                      <a:fillRect/>
+                    </a:stretch>
+                  </pic:blipFill>
+                  <pic:spPr>
+                    <a:xfrm>
+                      <a:off x="0" y="0"/>
+                      <a:ext cx="5731510" cy="4947920"/>
+                    </a:xfrm>
+                    <a:prstGeom prst="rect">
+                      <a:avLst/>
+                    </a:prstGeom>
+                  </pic:spPr>
+                </pic:pic>
+              </a:graphicData>
+            </a:graphic>
+          </wp:inline>
+        </w:drawing>
+      </w:r>
+      <w:r>
+        <w:rPr>
+          <w:noProof/>
+          <w:sz w:val="44"/>
+          <w:szCs w:val="44"/>
+          <w:u w:val="single"/>
+        </w:rPr>
+        <w:drawing>
+          <wp:inline distT="0" distB="0" distL="0" distR="0" wp14:anchorId="0A8DDDD0" wp14:editId="1E86724C">
+            <wp:extent cx="5731510" cy="3519170"/>
+            <wp:effectExtent l="0" t="0" r="0" b="0"/>
+            <wp:docPr id="767667422" name="Picture 13" descr="A computer screen shot of text&#10;&#10;AI-generated content may be incorrect."/>
+            <wp:cNvGraphicFramePr>
+              <a:graphicFrameLocks xmlns:a="http://schemas.openxmlformats.org/drawingml/2006/main" noChangeAspect="1"/>
+            </wp:cNvGraphicFramePr>
+            <a:graphic xmlns:a="http://schemas.openxmlformats.org/drawingml/2006/main">
+              <a:graphicData uri="http://schemas.openxmlformats.org/drawingml/2006/picture">
+                <pic:pic xmlns:pic="http://schemas.openxmlformats.org/drawingml/2006/picture">
+                  <pic:nvPicPr>
+                    <pic:cNvPr id="767667422" name="Picture 13" descr="A computer screen shot of text&#10;&#10;AI-generated content may be incorrect."/>
+                    <pic:cNvPicPr/>
+                  </pic:nvPicPr>
+                  <pic:blipFill>
+                    <a:blip r:embed="rId19" cstate="print">
+                      <a:extLst>
+                        <a:ext uri="{28A0092B-C50C-407E-A947-70E740481C1C}">
+                          <a14:useLocalDpi xmlns:a14="http://schemas.microsoft.com/office/drawing/2010/main" val="0"/>
+                        </a:ext>
+                      </a:extLst>
+                    </a:blip>
+                    <a:stretch>
+                      <a:fillRect/>
+                    </a:stretch>
+                  </pic:blipFill>
+                  <pic:spPr>
+                    <a:xfrm>
+                      <a:off x="0" y="0"/>
+                      <a:ext cx="5731510" cy="3519170"/>
+                    </a:xfrm>
+                    <a:prstGeom prst="rect">
+                      <a:avLst/>
+                    </a:prstGeom>
+                  </pic:spPr>
+                </pic:pic>
+              </a:graphicData>
+            </a:graphic>
+          </wp:inline>
+        </w:drawing>
+      </w:r>
+    </w:p>
+    <w:p>
+      <w:pPr>
+        <w:jc w:val="both"/>
+        <w:rPr>
+          <w:sz w:val="44"/>
+          <w:szCs w:val="44"/>
+          <w:u w:val="single"/>
+        </w:rPr>
+      </w:pPr>
+      <w:r>
+        <w:rPr>
+          <w:noProof/>
+          <w:sz w:val="44"/>
+          <w:szCs w:val="44"/>
+          <w:u w:val="single"/>
+        </w:rPr>
+        <w:lastRenderedPageBreak/>
+        <w:drawing>
+          <wp:inline distT="0" distB="0" distL="0" distR="0" wp14:anchorId="13B8ADCC" wp14:editId="5A7390CA">
+            <wp:extent cx="5731510" cy="3160395"/>
+            <wp:effectExtent l="0" t="0" r="0" b="1905"/>
+            <wp:docPr id="2130292960" name="Picture 15" descr="A screenshot of a computer&#10;&#10;AI-generated content may be incorrect."/>
+            <wp:cNvGraphicFramePr>
+              <a:graphicFrameLocks xmlns:a="http://schemas.openxmlformats.org/drawingml/2006/main" noChangeAspect="1"/>
+            </wp:cNvGraphicFramePr>
+            <a:graphic xmlns:a="http://schemas.openxmlformats.org/drawingml/2006/main">
+              <a:graphicData uri="http://schemas.openxmlformats.org/drawingml/2006/picture">
+                <pic:pic xmlns:pic="http://schemas.openxmlformats.org/drawingml/2006/picture">
+                  <pic:nvPicPr>
+                    <pic:cNvPr id="2130292960" name="Picture 15" descr="A screenshot of a computer&#10;&#10;AI-generated content may be incorrect."/>
+                    <pic:cNvPicPr/>
+                  </pic:nvPicPr>
+                  <pic:blipFill>
+                    <a:blip r:embed="rId20" cstate="print">
+                      <a:extLst>
+                        <a:ext uri="{28A0092B-C50C-407E-A947-70E740481C1C}">
+                          <a14:useLocalDpi xmlns:a14="http://schemas.microsoft.com/office/drawing/2010/main" val="0"/>
+                        </a:ext>
+                      </a:extLst>
+                    </a:blip>
+                    <a:stretch>
+                      <a:fillRect/>
+                    </a:stretch>
+                  </pic:blipFill>
+                  <pic:spPr>
+                    <a:xfrm>
+                      <a:off x="0" y="0"/>
+                      <a:ext cx="5731510" cy="3160395"/>
+                    </a:xfrm>
+                    <a:prstGeom prst="rect">
+                      <a:avLst/>
+                    </a:prstGeom>
+                  </pic:spPr>
+                </pic:pic>
+              </a:graphicData>
+            </a:graphic>
+          </wp:inline>
+        </w:drawing>
+      </w:r>
+    </w:p>
+    <w:p>
+      <w:pPr>
+        <w:jc w:val="both"/>
+        <w:rPr>
+          <w:sz w:val="44"/>
+          <w:szCs w:val="44"/>
+          <w:u w:val="single"/>
+        </w:rPr>
+      </w:pPr>
+      <w:r>
+        <w:rPr>
+          <w:noProof/>
+          <w:sz w:val="44"/>
+          <w:szCs w:val="44"/>
+          <w:u w:val="single"/>
+        </w:rPr>
+        <w:drawing>
+          <wp:inline distT="0" distB="0" distL="0" distR="0" wp14:anchorId="089B3EA8" wp14:editId="08630997">
+            <wp:extent cx="5731510" cy="3128645"/>
+            <wp:effectExtent l="0" t="0" r="0" b="0"/>
+            <wp:docPr id="1217031120" name="Picture 16" descr="A screenshot of a computer&#10;&#10;AI-generated content may be incorrect."/>
+            <wp:cNvGraphicFramePr>
+              <a:graphicFrameLocks xmlns:a="http://schemas.openxmlformats.org/drawingml/2006/main" noChangeAspect="1"/>
+            </wp:cNvGraphicFramePr>
+            <a:graphic xmlns:a="http://schemas.openxmlformats.org/drawingml/2006/main">
+              <a:graphicData uri="http://schemas.openxmlformats.org/drawingml/2006/picture">
+                <pic:pic xmlns:pic="http://schemas.openxmlformats.org/drawingml/2006/picture">
+                  <pic:nvPicPr>
+                    <pic:cNvPr id="1217031120" name="Picture 16" descr="A screenshot of a computer&#10;&#10;AI-generated content may be incorrect."/>
+                    <pic:cNvPicPr/>
+                  </pic:nvPicPr>
+                  <pic:blipFill>
+                    <a:blip r:embed="rId21" cstate="print">
+                      <a:extLst>
+                        <a:ext uri="{28A0092B-C50C-407E-A947-70E740481C1C}">
+                          <a14:useLocalDpi xmlns:a14="http://schemas.microsoft.com/office/drawing/2010/main" val="0"/>
+                        </a:ext>
+                      </a:extLst>
+                    </a:blip>
+                    <a:stretch>
+                      <a:fillRect/>
+                    </a:stretch>
+                  </pic:blipFill>
+                  <pic:spPr>
+                    <a:xfrm>
+                      <a:off x="0" y="0"/>
+                      <a:ext cx="5731510" cy="3128645"/>
+                    </a:xfrm>
+                    <a:prstGeom prst="rect">
+                      <a:avLst/>
+                    </a:prstGeom>
+                  </pic:spPr>
+                </pic:pic>
+              </a:graphicData>
+            </a:graphic>
+          </wp:inline>
+        </w:drawing>
+      </w:r>
+    </w:p>
+    <w:p>
+      <w:pPr>
+        <w:jc w:val="both"/>
+        <w:rPr>
+          <w:sz w:val="44"/>
+          <w:szCs w:val="44"/>
+          <w:u w:val="single"/>
+        </w:rPr>
+      </w:pPr>
+      <w:r>
+        <w:rPr>
+          <w:noProof/>
+          <w:sz w:val="44"/>
+          <w:szCs w:val="44"/>
+          <w:u w:val="single"/>
+        </w:rPr>
+        <w:lastRenderedPageBreak/>
+        <w:drawing>
+          <wp:inline distT="0" distB="0" distL="0" distR="0" wp14:anchorId="0AB2AD56" wp14:editId="3EC0E020">
+            <wp:extent cx="5731510" cy="3178810"/>
+            <wp:effectExtent l="0" t="0" r="0" b="0"/>
+            <wp:docPr id="904354852" name="Picture 17" descr="A graph on a white sheet&#10;&#10;AI-generated content may be incorrect."/>
+            <wp:cNvGraphicFramePr>
+              <a:graphicFrameLocks xmlns:a="http://schemas.openxmlformats.org/drawingml/2006/main" noChangeAspect="1"/>
+            </wp:cNvGraphicFramePr>
+            <a:graphic xmlns:a="http://schemas.openxmlformats.org/drawingml/2006/main">
+              <a:graphicData uri="http://schemas.openxmlformats.org/drawingml/2006/picture">
+                <pic:pic xmlns:pic="http://schemas.openxmlformats.org/drawingml/2006/picture">
+                  <pic:nvPicPr>
+                    <pic:cNvPr id="904354852" name="Picture 17" descr="A graph on a white sheet&#10;&#10;AI-generated content may be incorrect."/>
+                    <pic:cNvPicPr/>
+                  </pic:nvPicPr>
+                  <pic:blipFill>
+                    <a:blip r:embed="rId22" cstate="print">
+                      <a:extLst>
+                        <a:ext uri="{28A0092B-C50C-407E-A947-70E740481C1C}">
+                          <a14:useLocalDpi xmlns:a14="http://schemas.microsoft.com/office/drawing/2010/main" val="0"/>
+                        </a:ext>
+                      </a:extLst>
+                    </a:blip>
+                    <a:stretch>
+                      <a:fillRect/>
+                    </a:stretch>
+                  </pic:blipFill>
+                  <pic:spPr>
+                    <a:xfrm>
+                      <a:off x="0" y="0"/>
+                      <a:ext cx="5731510" cy="3178810"/>
+                    </a:xfrm>
+                    <a:prstGeom prst="rect">
+                      <a:avLst/>
+                    </a:prstGeom>
+                  </pic:spPr>
+                </pic:pic>
+              </a:graphicData>
+            </a:graphic>
+          </wp:inline>
+        </w:drawing>
+      </w:r>
     </w:p>
     <w:p>
       <w:pPr>

</xml_diff>

<commit_message>
Update logbook: add weekly task summaries
</commit_message>
<xml_diff>
--- a/LABlogbook.docx
+++ b/LABlogbook.docx
@@ -108,6 +108,90 @@
       <w:pPr>
         <w:jc w:val="both"/>
         <w:rPr>
+          <w:sz w:val="36"/>
+          <w:szCs w:val="36"/>
+        </w:rPr>
+      </w:pPr>
+      <w:r>
+        <w:rPr>
+          <w:sz w:val="36"/>
+          <w:szCs w:val="36"/>
+        </w:rPr>
+        <w:t xml:space="preserve">This week, </w:t>
+      </w:r>
+      <w:r>
+        <w:rPr>
+          <w:sz w:val="36"/>
+          <w:szCs w:val="36"/>
+        </w:rPr>
+        <w:t xml:space="preserve">I used NumPy’s </w:t>
+      </w:r>
+      <w:proofErr w:type="gramStart"/>
+      <w:r>
+        <w:rPr>
+          <w:sz w:val="36"/>
+          <w:szCs w:val="36"/>
+        </w:rPr>
+        <w:t>arrange(</w:t>
+      </w:r>
+      <w:proofErr w:type="gramEnd"/>
+      <w:r>
+        <w:rPr>
+          <w:sz w:val="36"/>
+          <w:szCs w:val="36"/>
+        </w:rPr>
+        <w:t xml:space="preserve">) to create an array based on the last two digits of my </w:t>
+      </w:r>
+      <w:r>
+        <w:rPr>
+          <w:sz w:val="36"/>
+          <w:szCs w:val="36"/>
+        </w:rPr>
+        <w:t>S</w:t>
+      </w:r>
+      <w:r>
+        <w:rPr>
+          <w:sz w:val="36"/>
+          <w:szCs w:val="36"/>
+        </w:rPr>
+        <w:t>tudent ID</w:t>
+      </w:r>
+      <w:r>
+        <w:rPr>
+          <w:sz w:val="36"/>
+          <w:szCs w:val="36"/>
+        </w:rPr>
+        <w:t xml:space="preserve"> (SID)</w:t>
+      </w:r>
+      <w:r>
+        <w:rPr>
+          <w:sz w:val="36"/>
+          <w:szCs w:val="36"/>
+        </w:rPr>
+        <w:t xml:space="preserve">. Then I reshaped </w:t>
+      </w:r>
+      <w:r>
+        <w:rPr>
+          <w:sz w:val="36"/>
+          <w:szCs w:val="36"/>
+        </w:rPr>
+        <w:lastRenderedPageBreak/>
+        <w:t>it into 2D array with one row and printed both the original and reshaped arrays, checking their shapes.</w:t>
+      </w:r>
+    </w:p>
+    <w:p>
+      <w:pPr>
+        <w:jc w:val="both"/>
+        <w:rPr>
+          <w:sz w:val="44"/>
+          <w:szCs w:val="44"/>
+        </w:rPr>
+      </w:pPr>
+    </w:p>
+    <w:p>
+      <w:pPr>
+        <w:jc w:val="both"/>
+        <w:rPr>
           <w:sz w:val="44"/>
           <w:szCs w:val="44"/>
           <w:u w:val="single"/>
@@ -138,9 +222,8 @@
           <w:szCs w:val="44"/>
           <w:u w:val="single"/>
         </w:rPr>
-        <w:lastRenderedPageBreak/>
         <w:drawing>
-          <wp:inline distT="0" distB="0" distL="0" distR="0" wp14:anchorId="78F0B1E5" wp14:editId="6DB66435">
+          <wp:inline distT="0" distB="0" distL="0" distR="0" wp14:anchorId="78F0B1E5" wp14:editId="32AA7A27">
             <wp:extent cx="5868365" cy="5579694"/>
             <wp:effectExtent l="0" t="0" r="0" b="0"/>
             <wp:docPr id="487666157" name="Picture 1" descr="A screenshot of a computer program&#10;&#10;AI-generated content may be incorrect."/>
@@ -186,17 +269,34 @@
       <w:pPr>
         <w:jc w:val="both"/>
         <w:rPr>
-          <w:sz w:val="44"/>
-          <w:szCs w:val="44"/>
-          <w:u w:val="single"/>
-        </w:rPr>
-      </w:pPr>
-      <w:r>
-        <w:rPr>
-          <w:sz w:val="44"/>
-          <w:szCs w:val="44"/>
-          <w:u w:val="single"/>
-        </w:rPr>
+          <w:sz w:val="36"/>
+          <w:szCs w:val="36"/>
+        </w:rPr>
+      </w:pPr>
+      <w:r>
+        <w:rPr>
+          <w:sz w:val="36"/>
+          <w:szCs w:val="36"/>
+        </w:rPr>
+        <w:t>This week, I loaded the dataset and grouped it by relationship and hours-per-week based on the last digit SID. I then reduced the hours-per-week column using that number grouped the data again to analyse the results.</w:t>
+      </w:r>
+    </w:p>
+    <w:p>
+      <w:pPr>
+        <w:jc w:val="both"/>
+        <w:rPr>
+          <w:sz w:val="44"/>
+          <w:szCs w:val="44"/>
+          <w:u w:val="single"/>
+        </w:rPr>
+      </w:pPr>
+      <w:r>
+        <w:rPr>
+          <w:sz w:val="44"/>
+          <w:szCs w:val="44"/>
+          <w:u w:val="single"/>
+        </w:rPr>
+        <w:lastRenderedPageBreak/>
         <w:t>Lab 3</w:t>
       </w:r>
     </w:p>
@@ -216,9 +316,8 @@
           <w:szCs w:val="44"/>
           <w:u w:val="single"/>
         </w:rPr>
-        <w:lastRenderedPageBreak/>
         <w:drawing>
-          <wp:inline distT="0" distB="0" distL="0" distR="0" wp14:anchorId="1D626FE9" wp14:editId="7C6C9C55">
+          <wp:inline distT="0" distB="0" distL="0" distR="0" wp14:anchorId="1D626FE9" wp14:editId="67A150ED">
             <wp:extent cx="4699322" cy="4891960"/>
             <wp:effectExtent l="0" t="0" r="0" b="0"/>
             <wp:docPr id="1334260156" name="Picture 2" descr="A screenshot of a computer program&#10;&#10;AI-generated content may be incorrect."/>
@@ -259,16 +358,6 @@
           </wp:inline>
         </w:drawing>
       </w:r>
-    </w:p>
-    <w:p>
-      <w:pPr>
-        <w:jc w:val="both"/>
-        <w:rPr>
-          <w:sz w:val="44"/>
-          <w:szCs w:val="44"/>
-          <w:u w:val="single"/>
-        </w:rPr>
-      </w:pPr>
     </w:p>
     <w:p>
       <w:pPr>
@@ -333,31 +422,25 @@
       <w:pPr>
         <w:jc w:val="both"/>
         <w:rPr>
-          <w:sz w:val="44"/>
-          <w:szCs w:val="44"/>
-          <w:u w:val="single"/>
-        </w:rPr>
-      </w:pPr>
-    </w:p>
-    <w:p>
-      <w:pPr>
-        <w:jc w:val="both"/>
-        <w:rPr>
-          <w:sz w:val="44"/>
-          <w:szCs w:val="44"/>
-          <w:u w:val="single"/>
-        </w:rPr>
-      </w:pPr>
-    </w:p>
-    <w:p>
-      <w:pPr>
-        <w:jc w:val="both"/>
-        <w:rPr>
-          <w:sz w:val="44"/>
-          <w:szCs w:val="44"/>
-          <w:u w:val="single"/>
-        </w:rPr>
-      </w:pPr>
+          <w:sz w:val="36"/>
+          <w:szCs w:val="36"/>
+        </w:rPr>
+      </w:pPr>
+      <w:r>
+        <w:rPr>
+          <w:sz w:val="36"/>
+          <w:szCs w:val="36"/>
+        </w:rPr>
+        <w:lastRenderedPageBreak/>
+        <w:t xml:space="preserve">I used seaborn to plot a scatter plot showing the interaction between two features based on the last two digits of my SID. I picked </w:t>
+      </w:r>
+      <w:r>
+        <w:rPr>
+          <w:sz w:val="36"/>
+          <w:szCs w:val="36"/>
+        </w:rPr>
+        <w:t xml:space="preserve">the right columns from the dataset and a clear diagram to show how they relate to each other. </w:t>
+      </w:r>
     </w:p>
     <w:p>
       <w:pPr>
@@ -404,7 +487,7 @@
           <w:u w:val="single"/>
         </w:rPr>
         <w:drawing>
-          <wp:inline distT="0" distB="0" distL="0" distR="0" wp14:anchorId="68F8CF3A" wp14:editId="05612F9F">
+          <wp:inline distT="0" distB="0" distL="0" distR="0" wp14:anchorId="68F8CF3A" wp14:editId="1DC9F3F9">
             <wp:extent cx="5731510" cy="3455035"/>
             <wp:effectExtent l="0" t="0" r="0" b="0"/>
             <wp:docPr id="1779173969" name="Picture 1" descr="A screenshot of a computer&#10;&#10;AI-generated content may be incorrect."/>
@@ -520,6 +603,63 @@
       <w:pPr>
         <w:jc w:val="both"/>
         <w:rPr>
+          <w:sz w:val="36"/>
+          <w:szCs w:val="36"/>
+        </w:rPr>
+      </w:pPr>
+      <w:r>
+        <w:rPr>
+          <w:sz w:val="36"/>
+          <w:szCs w:val="36"/>
+        </w:rPr>
+        <w:t>Built a two hidden layer MLP, setting the first layer size from the last three digits of my SID and making the second layer roughly half of that.</w:t>
+      </w:r>
+    </w:p>
+    <w:p>
+      <w:pPr>
+        <w:jc w:val="both"/>
+        <w:rPr>
+          <w:sz w:val="36"/>
+          <w:szCs w:val="36"/>
+        </w:rPr>
+      </w:pPr>
+      <w:r>
+        <w:rPr>
+          <w:sz w:val="36"/>
+          <w:szCs w:val="36"/>
+        </w:rPr>
+        <w:t>Kept the rest of the setup the same as the practical, then compiled and trained for 10 epochs.</w:t>
+      </w:r>
+    </w:p>
+    <w:p>
+      <w:pPr>
+        <w:jc w:val="both"/>
+        <w:rPr>
+          <w:sz w:val="36"/>
+          <w:szCs w:val="36"/>
+        </w:rPr>
+      </w:pPr>
+      <w:r>
+        <w:rPr>
+          <w:sz w:val="36"/>
+          <w:szCs w:val="36"/>
+        </w:rPr>
+        <w:t>Evaluated the test MAE and compared it directly with the MAE from the practical MLP.</w:t>
+      </w:r>
+    </w:p>
+    <w:p>
+      <w:pPr>
+        <w:jc w:val="both"/>
+        <w:rPr>
+          <w:sz w:val="44"/>
+          <w:szCs w:val="44"/>
+        </w:rPr>
+      </w:pPr>
+    </w:p>
+    <w:p>
+      <w:pPr>
+        <w:jc w:val="both"/>
+        <w:rPr>
           <w:sz w:val="44"/>
           <w:szCs w:val="44"/>
           <w:u w:val="single"/>
@@ -550,6 +690,7 @@
           <w:szCs w:val="44"/>
           <w:u w:val="single"/>
         </w:rPr>
+        <w:lastRenderedPageBreak/>
         <w:drawing>
           <wp:inline distT="0" distB="0" distL="0" distR="0" wp14:anchorId="1388D72D" wp14:editId="193CFC53">
             <wp:extent cx="5731510" cy="3515360"/>
@@ -609,7 +750,6 @@
           <w:szCs w:val="44"/>
           <w:u w:val="single"/>
         </w:rPr>
-        <w:lastRenderedPageBreak/>
         <w:drawing>
           <wp:inline distT="0" distB="0" distL="0" distR="0" wp14:anchorId="25B0E26C" wp14:editId="76FE6A32">
             <wp:extent cx="5731510" cy="3515360"/>
@@ -655,6 +795,91 @@
     </w:p>
     <w:p>
       <w:pPr>
+        <w:jc w:val="both"/>
+        <w:rPr>
+          <w:sz w:val="44"/>
+          <w:szCs w:val="44"/>
+          <w:u w:val="single"/>
+        </w:rPr>
+      </w:pPr>
+    </w:p>
+    <w:p>
+      <w:pPr>
+        <w:jc w:val="both"/>
+        <w:rPr>
+          <w:sz w:val="36"/>
+          <w:szCs w:val="36"/>
+        </w:rPr>
+      </w:pPr>
+      <w:r>
+        <w:rPr>
+          <w:sz w:val="36"/>
+          <w:szCs w:val="36"/>
+        </w:rPr>
+        <w:t xml:space="preserve">For Week 5, I took the practical CNN for EUR/USD and tweaked only the required knobs: convolution core size down to 5, and </w:t>
+      </w:r>
+      <w:proofErr w:type="spellStart"/>
+      <w:r>
+        <w:rPr>
+          <w:sz w:val="36"/>
+          <w:szCs w:val="36"/>
+        </w:rPr>
+        <w:t>batch_size</w:t>
+      </w:r>
+      <w:proofErr w:type="spellEnd"/>
+      <w:r>
+        <w:rPr>
+          <w:sz w:val="36"/>
+          <w:szCs w:val="36"/>
+        </w:rPr>
+        <w:t xml:space="preserve"> = 50.</w:t>
+      </w:r>
+    </w:p>
+    <w:p>
+      <w:pPr>
+        <w:jc w:val="both"/>
+        <w:rPr>
+          <w:sz w:val="36"/>
+          <w:szCs w:val="36"/>
+        </w:rPr>
+      </w:pPr>
+      <w:r>
+        <w:rPr>
+          <w:sz w:val="36"/>
+          <w:szCs w:val="36"/>
+        </w:rPr>
+        <w:lastRenderedPageBreak/>
+        <w:t>I set the epochs using the SID rule (based on the last two digits, Z and Y), then trained the model on the same data split as the practical.</w:t>
+      </w:r>
+    </w:p>
+    <w:p>
+      <w:pPr>
+        <w:jc w:val="both"/>
+        <w:rPr>
+          <w:sz w:val="36"/>
+          <w:szCs w:val="36"/>
+        </w:rPr>
+      </w:pPr>
+      <w:r>
+        <w:rPr>
+          <w:sz w:val="36"/>
+          <w:szCs w:val="36"/>
+        </w:rPr>
+        <w:t>Finally, I reported the test MAE and compared it against the practical CNN MAE, keeping screenshots of the model summary, training run, and MAE output.</w:t>
+      </w:r>
+    </w:p>
+    <w:p>
+      <w:pPr>
+        <w:jc w:val="both"/>
+        <w:rPr>
+          <w:sz w:val="44"/>
+          <w:szCs w:val="44"/>
+          <w:u w:val="single"/>
+        </w:rPr>
+      </w:pPr>
+    </w:p>
+    <w:p>
+      <w:pPr>
         <w:pStyle w:val="Heading1"/>
         <w:rPr>
           <w:b/>
@@ -683,7 +908,7 @@
           <w:noProof/>
         </w:rPr>
         <w:drawing>
-          <wp:inline distT="0" distB="0" distL="0" distR="0" wp14:anchorId="0CC855C4" wp14:editId="4B1BD257">
+          <wp:inline distT="0" distB="0" distL="0" distR="0" wp14:anchorId="0CC855C4" wp14:editId="5334706D">
             <wp:extent cx="5731510" cy="4110355"/>
             <wp:effectExtent l="0" t="0" r="0" b="4445"/>
             <wp:docPr id="427495545" name="Picture 1" descr="A screenshot of a computer program&#10;&#10;AI-generated content may be incorrect."/>
@@ -789,6 +1014,121 @@
       <w:pPr>
         <w:jc w:val="both"/>
         <w:rPr>
+          <w:sz w:val="36"/>
+          <w:szCs w:val="36"/>
+        </w:rPr>
+      </w:pPr>
+      <w:r>
+        <w:rPr>
+          <w:sz w:val="36"/>
+          <w:szCs w:val="36"/>
+        </w:rPr>
+        <w:t>I worked with the merged GOLD dataset and pulled out a specific slice of rows based on my SID.</w:t>
+      </w:r>
+    </w:p>
+    <w:p>
+      <w:pPr>
+        <w:jc w:val="both"/>
+        <w:rPr>
+          <w:sz w:val="36"/>
+          <w:szCs w:val="36"/>
+        </w:rPr>
+      </w:pPr>
+      <w:r>
+        <w:rPr>
+          <w:sz w:val="36"/>
+          <w:szCs w:val="36"/>
+        </w:rPr>
+        <w:t>Using the last 5 digits as the start point and the last 3 digits as the time window (in minutes), I selected that segment from the data.</w:t>
+      </w:r>
+    </w:p>
+    <w:p>
+      <w:pPr>
+        <w:jc w:val="both"/>
+        <w:rPr>
+          <w:sz w:val="36"/>
+          <w:szCs w:val="36"/>
+        </w:rPr>
+      </w:pPr>
+      <w:r>
+        <w:rPr>
+          <w:sz w:val="36"/>
+          <w:szCs w:val="36"/>
+        </w:rPr>
+        <w:t xml:space="preserve">Finally, I plotted </w:t>
+      </w:r>
+      <w:proofErr w:type="spellStart"/>
+      <w:r>
+        <w:rPr>
+          <w:sz w:val="36"/>
+          <w:szCs w:val="36"/>
+        </w:rPr>
+        <w:t>High_Bid</w:t>
+      </w:r>
+      <w:proofErr w:type="spellEnd"/>
+      <w:r>
+        <w:rPr>
+          <w:sz w:val="36"/>
+          <w:szCs w:val="36"/>
+        </w:rPr>
+        <w:t xml:space="preserve"> and </w:t>
+      </w:r>
+      <w:proofErr w:type="spellStart"/>
+      <w:r>
+        <w:rPr>
+          <w:sz w:val="36"/>
+          <w:szCs w:val="36"/>
+        </w:rPr>
+        <w:t>Low_Bid</w:t>
+      </w:r>
+      <w:proofErr w:type="spellEnd"/>
+      <w:r>
+        <w:rPr>
+          <w:sz w:val="36"/>
+          <w:szCs w:val="36"/>
+        </w:rPr>
+        <w:t xml:space="preserve"> for that slice using </w:t>
+      </w:r>
+      <w:proofErr w:type="spellStart"/>
+      <w:proofErr w:type="gramStart"/>
+      <w:r>
+        <w:rPr>
+          <w:sz w:val="36"/>
+          <w:szCs w:val="36"/>
+        </w:rPr>
+        <w:t>iplot</w:t>
+      </w:r>
+      <w:proofErr w:type="spellEnd"/>
+      <w:r>
+        <w:rPr>
+          <w:sz w:val="36"/>
+          <w:szCs w:val="36"/>
+        </w:rPr>
+        <w:t>(</w:t>
+      </w:r>
+      <w:proofErr w:type="gramEnd"/>
+      <w:r>
+        <w:rPr>
+          <w:sz w:val="36"/>
+          <w:szCs w:val="36"/>
+        </w:rPr>
+        <w:t>) to show how prices moved over that period.</w:t>
+      </w:r>
+    </w:p>
+    <w:p>
+      <w:pPr>
+        <w:jc w:val="both"/>
+        <w:rPr>
+          <w:sz w:val="44"/>
+          <w:szCs w:val="44"/>
+          <w:u w:val="single"/>
+        </w:rPr>
+      </w:pPr>
+    </w:p>
+    <w:p>
+      <w:pPr>
+        <w:jc w:val="both"/>
+        <w:rPr>
           <w:sz w:val="44"/>
           <w:szCs w:val="44"/>
           <w:u w:val="single"/>
@@ -819,6 +1159,7 @@
           <w:szCs w:val="44"/>
           <w:u w:val="single"/>
         </w:rPr>
+        <w:lastRenderedPageBreak/>
         <w:drawing>
           <wp:inline distT="0" distB="0" distL="0" distR="0" wp14:anchorId="2FBBD557" wp14:editId="47F63353">
             <wp:extent cx="5731510" cy="3717290"/>
@@ -888,7 +1229,6 @@
           <w:szCs w:val="44"/>
           <w:u w:val="single"/>
         </w:rPr>
-        <w:lastRenderedPageBreak/>
         <w:drawing>
           <wp:inline distT="0" distB="0" distL="0" distR="0" wp14:anchorId="2B06B7D9" wp14:editId="395D363A">
             <wp:extent cx="5731510" cy="2881630"/>
@@ -948,6 +1288,7 @@
           <w:szCs w:val="44"/>
           <w:u w:val="single"/>
         </w:rPr>
+        <w:lastRenderedPageBreak/>
         <w:drawing>
           <wp:inline distT="0" distB="0" distL="0" distR="0" wp14:anchorId="32D67E92" wp14:editId="3F4E4942">
             <wp:extent cx="5731510" cy="2113280"/>
@@ -995,6 +1336,70 @@
       <w:pPr>
         <w:jc w:val="both"/>
         <w:rPr>
+          <w:sz w:val="36"/>
+          <w:szCs w:val="36"/>
+        </w:rPr>
+      </w:pPr>
+      <w:r>
+        <w:rPr>
+          <w:sz w:val="36"/>
+          <w:szCs w:val="36"/>
+        </w:rPr>
+        <w:t>I adjusted the LSTM setup using my SID, so the main LSTM units became ZY + 10, then I set epochs to 10 and early stopping patience to 3.</w:t>
+      </w:r>
+    </w:p>
+    <w:p>
+      <w:pPr>
+        <w:jc w:val="both"/>
+        <w:rPr>
+          <w:sz w:val="36"/>
+          <w:szCs w:val="36"/>
+        </w:rPr>
+      </w:pPr>
+      <w:r>
+        <w:rPr>
+          <w:sz w:val="36"/>
+          <w:szCs w:val="36"/>
+        </w:rPr>
+        <w:t xml:space="preserve">I trained the model on the same gold dataset as the </w:t>
+      </w:r>
+      <w:proofErr w:type="gramStart"/>
+      <w:r>
+        <w:rPr>
+          <w:sz w:val="36"/>
+          <w:szCs w:val="36"/>
+        </w:rPr>
+        <w:t>practical, and</w:t>
+      </w:r>
+      <w:proofErr w:type="gramEnd"/>
+      <w:r>
+        <w:rPr>
+          <w:sz w:val="36"/>
+          <w:szCs w:val="36"/>
+        </w:rPr>
+        <w:t xml:space="preserve"> saved the best version during training using validation loss.</w:t>
+      </w:r>
+    </w:p>
+    <w:p>
+      <w:pPr>
+        <w:jc w:val="both"/>
+        <w:rPr>
+          <w:sz w:val="36"/>
+          <w:szCs w:val="36"/>
+        </w:rPr>
+      </w:pPr>
+      <w:r>
+        <w:rPr>
+          <w:sz w:val="36"/>
+          <w:szCs w:val="36"/>
+        </w:rPr>
+        <w:t>Finally, I recorded the test MSE and MAE, then compared them with the practical model and included the MAE detail plot as evidence.</w:t>
+      </w:r>
+    </w:p>
+    <w:p>
+      <w:pPr>
+        <w:jc w:val="both"/>
+        <w:rPr>
           <w:sz w:val="44"/>
           <w:szCs w:val="44"/>
           <w:u w:val="single"/>
@@ -1028,63 +1433,98 @@
           <w:u w:val="single"/>
         </w:rPr>
       </w:pPr>
-    </w:p>
-    <w:p>
-      <w:pPr>
-        <w:jc w:val="both"/>
-        <w:rPr>
-          <w:sz w:val="44"/>
-          <w:szCs w:val="44"/>
-          <w:u w:val="single"/>
-        </w:rPr>
-      </w:pPr>
-    </w:p>
-    <w:p>
-      <w:pPr>
-        <w:jc w:val="both"/>
-        <w:rPr>
-          <w:sz w:val="44"/>
-          <w:szCs w:val="44"/>
-          <w:u w:val="single"/>
-        </w:rPr>
-      </w:pPr>
-    </w:p>
-    <w:p>
-      <w:pPr>
-        <w:jc w:val="both"/>
-        <w:rPr>
-          <w:sz w:val="44"/>
-          <w:szCs w:val="44"/>
-          <w:u w:val="single"/>
-        </w:rPr>
-      </w:pPr>
-    </w:p>
-    <w:p>
-      <w:pPr>
-        <w:jc w:val="both"/>
-        <w:rPr>
-          <w:sz w:val="44"/>
-          <w:szCs w:val="44"/>
-          <w:u w:val="single"/>
-        </w:rPr>
-      </w:pPr>
-    </w:p>
-    <w:p>
-      <w:pPr>
-        <w:jc w:val="both"/>
-        <w:rPr>
-          <w:sz w:val="44"/>
-          <w:szCs w:val="44"/>
-          <w:u w:val="single"/>
-        </w:rPr>
-      </w:pPr>
-      <w:r>
-        <w:rPr>
+      <w:r>
+        <w:rPr>
+          <w:noProof/>
           <w:sz w:val="44"/>
           <w:szCs w:val="44"/>
           <w:u w:val="single"/>
         </w:rPr>
         <w:lastRenderedPageBreak/>
+        <w:drawing>
+          <wp:inline distT="0" distB="0" distL="0" distR="0" wp14:anchorId="4883E85F" wp14:editId="6D40F50C">
+            <wp:extent cx="5731510" cy="3856355"/>
+            <wp:effectExtent l="0" t="0" r="0" b="4445"/>
+            <wp:docPr id="109864969" name="Picture 1" descr="A screen shot of a computer&#10;&#10;AI-generated content may be incorrect."/>
+            <wp:cNvGraphicFramePr>
+              <a:graphicFrameLocks xmlns:a="http://schemas.openxmlformats.org/drawingml/2006/main" noChangeAspect="1"/>
+            </wp:cNvGraphicFramePr>
+            <a:graphic xmlns:a="http://schemas.openxmlformats.org/drawingml/2006/main">
+              <a:graphicData uri="http://schemas.openxmlformats.org/drawingml/2006/picture">
+                <pic:pic xmlns:pic="http://schemas.openxmlformats.org/drawingml/2006/picture">
+                  <pic:nvPicPr>
+                    <pic:cNvPr id="109864969" name="Picture 1" descr="A screen shot of a computer&#10;&#10;AI-generated content may be incorrect."/>
+                    <pic:cNvPicPr/>
+                  </pic:nvPicPr>
+                  <pic:blipFill>
+                    <a:blip r:embed="rId17" cstate="print">
+                      <a:extLst>
+                        <a:ext uri="{28A0092B-C50C-407E-A947-70E740481C1C}">
+                          <a14:useLocalDpi xmlns:a14="http://schemas.microsoft.com/office/drawing/2010/main" val="0"/>
+                        </a:ext>
+                      </a:extLst>
+                    </a:blip>
+                    <a:stretch>
+                      <a:fillRect/>
+                    </a:stretch>
+                  </pic:blipFill>
+                  <pic:spPr>
+                    <a:xfrm>
+                      <a:off x="0" y="0"/>
+                      <a:ext cx="5731510" cy="3856355"/>
+                    </a:xfrm>
+                    <a:prstGeom prst="rect">
+                      <a:avLst/>
+                    </a:prstGeom>
+                  </pic:spPr>
+                </pic:pic>
+              </a:graphicData>
+            </a:graphic>
+          </wp:inline>
+        </w:drawing>
+      </w:r>
+    </w:p>
+    <w:p>
+      <w:pPr>
+        <w:jc w:val="both"/>
+        <w:rPr>
+          <w:sz w:val="36"/>
+          <w:szCs w:val="36"/>
+        </w:rPr>
+      </w:pPr>
+      <w:r>
+        <w:rPr>
+          <w:sz w:val="36"/>
+          <w:szCs w:val="36"/>
+        </w:rPr>
+        <w:t>This task focuses on tracking how the LSTM model learns over time by monitoring the Mean Absolute Error during training. The MAE graph shows how both training and validation errors change across epochs, helping to check whether the model is improving and not overfitting.</w:t>
+      </w:r>
+    </w:p>
+    <w:p>
+      <w:pPr>
+        <w:jc w:val="both"/>
+        <w:rPr>
+          <w:sz w:val="44"/>
+          <w:szCs w:val="44"/>
+          <w:u w:val="single"/>
+        </w:rPr>
+      </w:pPr>
+    </w:p>
+    <w:p>
+      <w:pPr>
+        <w:jc w:val="both"/>
+        <w:rPr>
+          <w:sz w:val="44"/>
+          <w:szCs w:val="44"/>
+          <w:u w:val="single"/>
+        </w:rPr>
+      </w:pPr>
+      <w:r>
+        <w:rPr>
+          <w:sz w:val="44"/>
+          <w:szCs w:val="44"/>
+          <w:u w:val="single"/>
+        </w:rPr>
         <w:t xml:space="preserve">Lab 9 </w:t>
       </w:r>
     </w:p>
@@ -1132,8 +1572,9 @@
           <w:szCs w:val="44"/>
           <w:u w:val="single"/>
         </w:rPr>
+        <w:lastRenderedPageBreak/>
         <w:drawing>
-          <wp:inline distT="0" distB="0" distL="0" distR="0" wp14:anchorId="49C2E09F" wp14:editId="4F4CEB25">
+          <wp:inline distT="0" distB="0" distL="0" distR="0" wp14:anchorId="49C2E09F" wp14:editId="02781118">
             <wp:extent cx="5731510" cy="5094605"/>
             <wp:effectExtent l="0" t="0" r="0" b="0"/>
             <wp:docPr id="933085977" name="Picture 14" descr="A screenshot of a computer program&#10;&#10;AI-generated content may be incorrect."/>
@@ -1148,7 +1589,7 @@
                     <pic:cNvPicPr/>
                   </pic:nvPicPr>
                   <pic:blipFill>
-                    <a:blip r:embed="rId17" cstate="print">
+                    <a:blip r:embed="rId18" cstate="print">
                       <a:extLst>
                         <a:ext uri="{28A0092B-C50C-407E-A947-70E740481C1C}">
                           <a14:useLocalDpi xmlns:a14="http://schemas.microsoft.com/office/drawing/2010/main" val="0"/>
@@ -1193,7 +1634,7 @@
         </w:rPr>
         <w:lastRenderedPageBreak/>
         <w:drawing>
-          <wp:inline distT="0" distB="0" distL="0" distR="0" wp14:anchorId="00EEDDBA" wp14:editId="26DB8A14">
+          <wp:inline distT="0" distB="0" distL="0" distR="0" wp14:anchorId="00EEDDBA" wp14:editId="3E3E98C8">
             <wp:extent cx="5731510" cy="4947920"/>
             <wp:effectExtent l="0" t="0" r="0" b="5080"/>
             <wp:docPr id="1420891525" name="Picture 12" descr="A screenshot of a computer program&#10;&#10;AI-generated content may be incorrect."/>
@@ -1208,7 +1649,7 @@
                     <pic:cNvPicPr/>
                   </pic:nvPicPr>
                   <pic:blipFill>
-                    <a:blip r:embed="rId18" cstate="print">
+                    <a:blip r:embed="rId19" cstate="print">
                       <a:extLst>
                         <a:ext uri="{28A0092B-C50C-407E-A947-70E740481C1C}">
                           <a14:useLocalDpi xmlns:a14="http://schemas.microsoft.com/office/drawing/2010/main" val="0"/>
@@ -1242,7 +1683,7 @@
           <w:u w:val="single"/>
         </w:rPr>
         <w:drawing>
-          <wp:inline distT="0" distB="0" distL="0" distR="0" wp14:anchorId="0A8DDDD0" wp14:editId="1E86724C">
+          <wp:inline distT="0" distB="0" distL="0" distR="0" wp14:anchorId="0A8DDDD0" wp14:editId="2489318C">
             <wp:extent cx="5731510" cy="3519170"/>
             <wp:effectExtent l="0" t="0" r="0" b="0"/>
             <wp:docPr id="767667422" name="Picture 13" descr="A computer screen shot of text&#10;&#10;AI-generated content may be incorrect."/>
@@ -1257,7 +1698,7 @@
                     <pic:cNvPicPr/>
                   </pic:nvPicPr>
                   <pic:blipFill>
-                    <a:blip r:embed="rId19" cstate="print">
+                    <a:blip r:embed="rId20" cstate="print">
                       <a:extLst>
                         <a:ext uri="{28A0092B-C50C-407E-A947-70E740481C1C}">
                           <a14:useLocalDpi xmlns:a14="http://schemas.microsoft.com/office/drawing/2010/main" val="0"/>
@@ -1317,7 +1758,7 @@
                     <pic:cNvPicPr/>
                   </pic:nvPicPr>
                   <pic:blipFill>
-                    <a:blip r:embed="rId20" cstate="print">
+                    <a:blip r:embed="rId21" cstate="print">
                       <a:extLst>
                         <a:ext uri="{28A0092B-C50C-407E-A947-70E740481C1C}">
                           <a14:useLocalDpi xmlns:a14="http://schemas.microsoft.com/office/drawing/2010/main" val="0"/>
@@ -1376,7 +1817,7 @@
                     <pic:cNvPicPr/>
                   </pic:nvPicPr>
                   <pic:blipFill>
-                    <a:blip r:embed="rId21" cstate="print">
+                    <a:blip r:embed="rId22" cstate="print">
                       <a:extLst>
                         <a:ext uri="{28A0092B-C50C-407E-A947-70E740481C1C}">
                           <a14:useLocalDpi xmlns:a14="http://schemas.microsoft.com/office/drawing/2010/main" val="0"/>
@@ -1436,7 +1877,7 @@
                     <pic:cNvPicPr/>
                   </pic:nvPicPr>
                   <pic:blipFill>
-                    <a:blip r:embed="rId22" cstate="print">
+                    <a:blip r:embed="rId23" cstate="print">
                       <a:extLst>
                         <a:ext uri="{28A0092B-C50C-407E-A947-70E740481C1C}">
                           <a14:useLocalDpi xmlns:a14="http://schemas.microsoft.com/office/drawing/2010/main" val="0"/>
@@ -1467,6 +1908,98 @@
       <w:pPr>
         <w:jc w:val="both"/>
         <w:rPr>
+          <w:sz w:val="36"/>
+          <w:szCs w:val="36"/>
+        </w:rPr>
+      </w:pPr>
+      <w:r>
+        <w:rPr>
+          <w:sz w:val="36"/>
+          <w:szCs w:val="36"/>
+        </w:rPr>
+        <w:t>I took the “best” LSTM from the practical, then tweaked the training settings using my SID (epochs and batch size).</w:t>
+      </w:r>
+    </w:p>
+    <w:p>
+      <w:pPr>
+        <w:jc w:val="both"/>
+        <w:rPr>
+          <w:sz w:val="36"/>
+          <w:szCs w:val="36"/>
+        </w:rPr>
+      </w:pPr>
+      <w:r>
+        <w:rPr>
+          <w:sz w:val="36"/>
+          <w:szCs w:val="36"/>
+        </w:rPr>
+        <w:t xml:space="preserve">I added </w:t>
+      </w:r>
+      <w:proofErr w:type="spellStart"/>
+      <w:r>
+        <w:rPr>
+          <w:sz w:val="36"/>
+          <w:szCs w:val="36"/>
+        </w:rPr>
+        <w:t>EarlyStopping</w:t>
+      </w:r>
+      <w:proofErr w:type="spellEnd"/>
+      <w:r>
+        <w:rPr>
+          <w:sz w:val="36"/>
+          <w:szCs w:val="36"/>
+        </w:rPr>
+        <w:t xml:space="preserve"> and </w:t>
+      </w:r>
+      <w:proofErr w:type="spellStart"/>
+      <w:proofErr w:type="gramStart"/>
+      <w:r>
+        <w:rPr>
+          <w:sz w:val="36"/>
+          <w:szCs w:val="36"/>
+        </w:rPr>
+        <w:t>ModelCheckpoint</w:t>
+      </w:r>
+      <w:proofErr w:type="spellEnd"/>
+      <w:proofErr w:type="gramEnd"/>
+      <w:r>
+        <w:rPr>
+          <w:sz w:val="36"/>
+          <w:szCs w:val="36"/>
+        </w:rPr>
+        <w:t xml:space="preserve"> so it stops wasting time and keeps the best version of the model.</w:t>
+      </w:r>
+    </w:p>
+    <w:p>
+      <w:pPr>
+        <w:jc w:val="both"/>
+        <w:rPr>
+          <w:sz w:val="36"/>
+          <w:szCs w:val="36"/>
+        </w:rPr>
+      </w:pPr>
+      <w:r>
+        <w:rPr>
+          <w:sz w:val="36"/>
+          <w:szCs w:val="36"/>
+        </w:rPr>
+        <w:t>Then I trained it again, reported the test accuracy/classification metrics, and plotted the more detailed accuracy graph.</w:t>
+      </w:r>
+    </w:p>
+    <w:p>
+      <w:pPr>
+        <w:jc w:val="both"/>
+        <w:rPr>
+          <w:sz w:val="44"/>
+          <w:szCs w:val="44"/>
+          <w:u w:val="single"/>
+        </w:rPr>
+      </w:pPr>
+    </w:p>
+    <w:p>
+      <w:pPr>
+        <w:jc w:val="both"/>
+        <w:rPr>
           <w:sz w:val="44"/>
           <w:szCs w:val="44"/>
           <w:u w:val="single"/>
@@ -1489,6 +2022,231 @@
           <w:szCs w:val="44"/>
         </w:rPr>
       </w:pPr>
+      <w:r>
+        <w:rPr>
+          <w:noProof/>
+          <w:sz w:val="44"/>
+          <w:szCs w:val="44"/>
+        </w:rPr>
+        <w:lastRenderedPageBreak/>
+        <w:drawing>
+          <wp:inline distT="0" distB="0" distL="0" distR="0" wp14:anchorId="0D2245AA" wp14:editId="069917F1">
+            <wp:extent cx="5731510" cy="2953385"/>
+            <wp:effectExtent l="0" t="0" r="0" b="5715"/>
+            <wp:docPr id="2119741958" name="Picture 5" descr="A screen shot of a computer&#10;&#10;AI-generated content may be incorrect."/>
+            <wp:cNvGraphicFramePr>
+              <a:graphicFrameLocks xmlns:a="http://schemas.openxmlformats.org/drawingml/2006/main" noChangeAspect="1"/>
+            </wp:cNvGraphicFramePr>
+            <a:graphic xmlns:a="http://schemas.openxmlformats.org/drawingml/2006/main">
+              <a:graphicData uri="http://schemas.openxmlformats.org/drawingml/2006/picture">
+                <pic:pic xmlns:pic="http://schemas.openxmlformats.org/drawingml/2006/picture">
+                  <pic:nvPicPr>
+                    <pic:cNvPr id="2119741958" name="Picture 5" descr="A screen shot of a computer&#10;&#10;AI-generated content may be incorrect."/>
+                    <pic:cNvPicPr/>
+                  </pic:nvPicPr>
+                  <pic:blipFill>
+                    <a:blip r:embed="rId24" cstate="print">
+                      <a:extLst>
+                        <a:ext uri="{28A0092B-C50C-407E-A947-70E740481C1C}">
+                          <a14:useLocalDpi xmlns:a14="http://schemas.microsoft.com/office/drawing/2010/main" val="0"/>
+                        </a:ext>
+                      </a:extLst>
+                    </a:blip>
+                    <a:stretch>
+                      <a:fillRect/>
+                    </a:stretch>
+                  </pic:blipFill>
+                  <pic:spPr>
+                    <a:xfrm>
+                      <a:off x="0" y="0"/>
+                      <a:ext cx="5731510" cy="2953385"/>
+                    </a:xfrm>
+                    <a:prstGeom prst="rect">
+                      <a:avLst/>
+                    </a:prstGeom>
+                  </pic:spPr>
+                </pic:pic>
+              </a:graphicData>
+            </a:graphic>
+          </wp:inline>
+        </w:drawing>
+      </w:r>
+    </w:p>
+    <w:p>
+      <w:pPr>
+        <w:jc w:val="both"/>
+        <w:rPr>
+          <w:sz w:val="44"/>
+          <w:szCs w:val="44"/>
+        </w:rPr>
+      </w:pPr>
+      <w:r>
+        <w:rPr>
+          <w:noProof/>
+          <w:sz w:val="44"/>
+          <w:szCs w:val="44"/>
+        </w:rPr>
+        <w:drawing>
+          <wp:inline distT="0" distB="0" distL="0" distR="0" wp14:anchorId="29468091" wp14:editId="76A72DE8">
+            <wp:extent cx="5731510" cy="2953385"/>
+            <wp:effectExtent l="0" t="0" r="0" b="5715"/>
+            <wp:docPr id="1727545167" name="Picture 6" descr="A screenshot of a computer&#10;&#10;AI-generated content may be incorrect."/>
+            <wp:cNvGraphicFramePr>
+              <a:graphicFrameLocks xmlns:a="http://schemas.openxmlformats.org/drawingml/2006/main" noChangeAspect="1"/>
+            </wp:cNvGraphicFramePr>
+            <a:graphic xmlns:a="http://schemas.openxmlformats.org/drawingml/2006/main">
+              <a:graphicData uri="http://schemas.openxmlformats.org/drawingml/2006/picture">
+                <pic:pic xmlns:pic="http://schemas.openxmlformats.org/drawingml/2006/picture">
+                  <pic:nvPicPr>
+                    <pic:cNvPr id="1727545167" name="Picture 6" descr="A screenshot of a computer&#10;&#10;AI-generated content may be incorrect."/>
+                    <pic:cNvPicPr/>
+                  </pic:nvPicPr>
+                  <pic:blipFill>
+                    <a:blip r:embed="rId25" cstate="print">
+                      <a:extLst>
+                        <a:ext uri="{28A0092B-C50C-407E-A947-70E740481C1C}">
+                          <a14:useLocalDpi xmlns:a14="http://schemas.microsoft.com/office/drawing/2010/main" val="0"/>
+                        </a:ext>
+                      </a:extLst>
+                    </a:blip>
+                    <a:stretch>
+                      <a:fillRect/>
+                    </a:stretch>
+                  </pic:blipFill>
+                  <pic:spPr>
+                    <a:xfrm>
+                      <a:off x="0" y="0"/>
+                      <a:ext cx="5731510" cy="2953385"/>
+                    </a:xfrm>
+                    <a:prstGeom prst="rect">
+                      <a:avLst/>
+                    </a:prstGeom>
+                  </pic:spPr>
+                </pic:pic>
+              </a:graphicData>
+            </a:graphic>
+          </wp:inline>
+        </w:drawing>
+      </w:r>
+    </w:p>
+    <w:p>
+      <w:pPr>
+        <w:jc w:val="both"/>
+        <w:rPr>
+          <w:sz w:val="44"/>
+          <w:szCs w:val="44"/>
+        </w:rPr>
+      </w:pPr>
+      <w:r>
+        <w:rPr>
+          <w:noProof/>
+          <w:sz w:val="44"/>
+          <w:szCs w:val="44"/>
+        </w:rPr>
+        <w:lastRenderedPageBreak/>
+        <w:drawing>
+          <wp:inline distT="0" distB="0" distL="0" distR="0" wp14:anchorId="3699C3A8" wp14:editId="280ADA05">
+            <wp:extent cx="5731510" cy="2953385"/>
+            <wp:effectExtent l="0" t="0" r="0" b="5715"/>
+            <wp:docPr id="470462795" name="Picture 8" descr="A screenshot of a graph&#10;&#10;AI-generated content may be incorrect."/>
+            <wp:cNvGraphicFramePr>
+              <a:graphicFrameLocks xmlns:a="http://schemas.openxmlformats.org/drawingml/2006/main" noChangeAspect="1"/>
+            </wp:cNvGraphicFramePr>
+            <a:graphic xmlns:a="http://schemas.openxmlformats.org/drawingml/2006/main">
+              <a:graphicData uri="http://schemas.openxmlformats.org/drawingml/2006/picture">
+                <pic:pic xmlns:pic="http://schemas.openxmlformats.org/drawingml/2006/picture">
+                  <pic:nvPicPr>
+                    <pic:cNvPr id="470462795" name="Picture 8" descr="A screenshot of a graph&#10;&#10;AI-generated content may be incorrect."/>
+                    <pic:cNvPicPr/>
+                  </pic:nvPicPr>
+                  <pic:blipFill>
+                    <a:blip r:embed="rId26" cstate="print">
+                      <a:extLst>
+                        <a:ext uri="{28A0092B-C50C-407E-A947-70E740481C1C}">
+                          <a14:useLocalDpi xmlns:a14="http://schemas.microsoft.com/office/drawing/2010/main" val="0"/>
+                        </a:ext>
+                      </a:extLst>
+                    </a:blip>
+                    <a:stretch>
+                      <a:fillRect/>
+                    </a:stretch>
+                  </pic:blipFill>
+                  <pic:spPr>
+                    <a:xfrm>
+                      <a:off x="0" y="0"/>
+                      <a:ext cx="5731510" cy="2953385"/>
+                    </a:xfrm>
+                    <a:prstGeom prst="rect">
+                      <a:avLst/>
+                    </a:prstGeom>
+                  </pic:spPr>
+                </pic:pic>
+              </a:graphicData>
+            </a:graphic>
+          </wp:inline>
+        </w:drawing>
+      </w:r>
+    </w:p>
+    <w:p>
+      <w:pPr>
+        <w:rPr>
+          <w:sz w:val="36"/>
+          <w:szCs w:val="36"/>
+        </w:rPr>
+      </w:pPr>
+      <w:r>
+        <w:rPr>
+          <w:sz w:val="36"/>
+          <w:szCs w:val="36"/>
+        </w:rPr>
+        <w:t>Built and trained an LSTM model for the credit scoring classification task using the same dataset split.</w:t>
+      </w:r>
+    </w:p>
+    <w:p>
+      <w:pPr>
+        <w:rPr>
+          <w:sz w:val="36"/>
+          <w:szCs w:val="36"/>
+        </w:rPr>
+      </w:pPr>
+      <w:r>
+        <w:rPr>
+          <w:sz w:val="36"/>
+          <w:szCs w:val="36"/>
+        </w:rPr>
+        <w:t>Generated the LSTM’s Accuracy, Precision, Recall, F1-score, and AUC from the test set predictions.</w:t>
+      </w:r>
+    </w:p>
+    <w:p>
+      <w:pPr>
+        <w:rPr>
+          <w:sz w:val="36"/>
+          <w:szCs w:val="36"/>
+        </w:rPr>
+      </w:pPr>
+      <w:r>
+        <w:rPr>
+          <w:sz w:val="36"/>
+          <w:szCs w:val="36"/>
+        </w:rPr>
+        <w:t>Added those LSTM metrics to the existing model comparison chart so it sits next to Random Forest, Logistic Regression, and MLP.</w:t>
+      </w:r>
+      <w:r>
+        <w:rPr>
+          <w:sz w:val="36"/>
+          <w:szCs w:val="36"/>
+        </w:rPr>
+        <w:t>–</w:t>
+      </w:r>
+    </w:p>
+    <w:p>
+      <w:pPr>
+        <w:jc w:val="both"/>
+        <w:rPr>
+          <w:sz w:val="44"/>
+          <w:szCs w:val="44"/>
+        </w:rPr>
+      </w:pPr>
     </w:p>
     <w:p>
       <w:pPr>
@@ -1507,6 +2265,16 @@
         </w:rPr>
         <w:t>Lab 12</w:t>
       </w:r>
+    </w:p>
+    <w:p>
+      <w:pPr>
+        <w:jc w:val="both"/>
+        <w:rPr>
+          <w:sz w:val="44"/>
+          <w:szCs w:val="44"/>
+          <w:u w:val="single"/>
+        </w:rPr>
+      </w:pPr>
     </w:p>
     <w:sectPr>
       <w:pgSz w:w="11906" w:h="16838"/>
@@ -1980,6 +2748,32 @@
       <w:szCs w:val="32"/>
     </w:rPr>
   </w:style>
+  <w:style w:type="paragraph" w:customStyle="1" w:styleId="p1">
+    <w:name w:val="p1"/>
+    <w:basedOn w:val="Normal"/>
+    <w:rsid w:val="00F05358"/>
+    <w:pPr>
+      <w:spacing w:before="100" w:beforeAutospacing="1" w:after="100" w:afterAutospacing="1" w:line="240" w:lineRule="auto"/>
+    </w:pPr>
+    <w:rPr>
+      <w:rFonts w:ascii="Times New Roman" w:eastAsia="Times New Roman" w:hAnsi="Times New Roman" w:cs="Times New Roman"/>
+      <w:kern w:val="0"/>
+      <w:sz w:val="24"/>
+      <w:szCs w:val="24"/>
+      <w:lang w:eastAsia="en-GB"/>
+      <w14:ligatures w14:val="none"/>
+    </w:rPr>
+  </w:style>
+  <w:style w:type="character" w:customStyle="1" w:styleId="s1">
+    <w:name w:val="s1"/>
+    <w:basedOn w:val="DefaultParagraphFont"/>
+    <w:rsid w:val="00F05358"/>
+  </w:style>
+  <w:style w:type="character" w:customStyle="1" w:styleId="s2">
+    <w:name w:val="s2"/>
+    <w:basedOn w:val="DefaultParagraphFont"/>
+    <w:rsid w:val="00D551D8"/>
+  </w:style>
 </w:styles>
 </file>
 

</xml_diff>

<commit_message>
Update logbook: add github link
</commit_message>
<xml_diff>
--- a/LABlogbook.docx
+++ b/LABlogbook.docx
@@ -77,7 +77,7 @@
                     <pic:cNvPicPr/>
                   </pic:nvPicPr>
                   <pic:blipFill>
-                    <a:blip r:embed="rId4">
+                    <a:blip r:embed="rId5">
                       <a:extLst>
                         <a:ext uri="{28A0092B-C50C-407E-A947-70E740481C1C}">
                           <a14:useLocalDpi xmlns:a14="http://schemas.microsoft.com/office/drawing/2010/main" val="0"/>
@@ -223,7 +223,7 @@
           <w:u w:val="single"/>
         </w:rPr>
         <w:drawing>
-          <wp:inline distT="0" distB="0" distL="0" distR="0" wp14:anchorId="78F0B1E5" wp14:editId="32AA7A27">
+          <wp:inline distT="0" distB="0" distL="0" distR="0" wp14:anchorId="78F0B1E5" wp14:editId="5F8D8573">
             <wp:extent cx="5868365" cy="5579694"/>
             <wp:effectExtent l="0" t="0" r="0" b="0"/>
             <wp:docPr id="487666157" name="Picture 1" descr="A screenshot of a computer program&#10;&#10;AI-generated content may be incorrect."/>
@@ -238,7 +238,7 @@
                     <pic:cNvPicPr/>
                   </pic:nvPicPr>
                   <pic:blipFill>
-                    <a:blip r:embed="rId5" cstate="print">
+                    <a:blip r:embed="rId6" cstate="print">
                       <a:extLst>
                         <a:ext uri="{28A0092B-C50C-407E-A947-70E740481C1C}">
                           <a14:useLocalDpi xmlns:a14="http://schemas.microsoft.com/office/drawing/2010/main" val="0"/>
@@ -317,7 +317,7 @@
           <w:u w:val="single"/>
         </w:rPr>
         <w:drawing>
-          <wp:inline distT="0" distB="0" distL="0" distR="0" wp14:anchorId="1D626FE9" wp14:editId="67A150ED">
+          <wp:inline distT="0" distB="0" distL="0" distR="0" wp14:anchorId="1D626FE9" wp14:editId="14B42F76">
             <wp:extent cx="4699322" cy="4891960"/>
             <wp:effectExtent l="0" t="0" r="0" b="0"/>
             <wp:docPr id="1334260156" name="Picture 2" descr="A screenshot of a computer program&#10;&#10;AI-generated content may be incorrect."/>
@@ -332,7 +332,7 @@
                     <pic:cNvPicPr/>
                   </pic:nvPicPr>
                   <pic:blipFill>
-                    <a:blip r:embed="rId6" cstate="print">
+                    <a:blip r:embed="rId7" cstate="print">
                       <a:extLst>
                         <a:ext uri="{28A0092B-C50C-407E-A947-70E740481C1C}">
                           <a14:useLocalDpi xmlns:a14="http://schemas.microsoft.com/office/drawing/2010/main" val="0"/>
@@ -391,7 +391,7 @@
                     <pic:cNvPicPr/>
                   </pic:nvPicPr>
                   <pic:blipFill>
-                    <a:blip r:embed="rId7" cstate="print">
+                    <a:blip r:embed="rId8" cstate="print">
                       <a:extLst>
                         <a:ext uri="{28A0092B-C50C-407E-A947-70E740481C1C}">
                           <a14:useLocalDpi xmlns:a14="http://schemas.microsoft.com/office/drawing/2010/main" val="0"/>
@@ -487,7 +487,7 @@
           <w:u w:val="single"/>
         </w:rPr>
         <w:drawing>
-          <wp:inline distT="0" distB="0" distL="0" distR="0" wp14:anchorId="68F8CF3A" wp14:editId="1DC9F3F9">
+          <wp:inline distT="0" distB="0" distL="0" distR="0" wp14:anchorId="68F8CF3A" wp14:editId="5D0144AB">
             <wp:extent cx="5731510" cy="3455035"/>
             <wp:effectExtent l="0" t="0" r="0" b="0"/>
             <wp:docPr id="1779173969" name="Picture 1" descr="A screenshot of a computer&#10;&#10;AI-generated content may be incorrect."/>
@@ -502,7 +502,7 @@
                     <pic:cNvPicPr/>
                   </pic:nvPicPr>
                   <pic:blipFill>
-                    <a:blip r:embed="rId8" cstate="print">
+                    <a:blip r:embed="rId9" cstate="print">
                       <a:extLst>
                         <a:ext uri="{28A0092B-C50C-407E-A947-70E740481C1C}">
                           <a14:useLocalDpi xmlns:a14="http://schemas.microsoft.com/office/drawing/2010/main" val="0"/>
@@ -572,7 +572,7 @@
                     <pic:cNvPicPr/>
                   </pic:nvPicPr>
                   <pic:blipFill>
-                    <a:blip r:embed="rId9" cstate="print">
+                    <a:blip r:embed="rId10" cstate="print">
                       <a:extLst>
                         <a:ext uri="{28A0092B-C50C-407E-A947-70E740481C1C}">
                           <a14:useLocalDpi xmlns:a14="http://schemas.microsoft.com/office/drawing/2010/main" val="0"/>
@@ -704,65 +704,6 @@
                 <pic:pic xmlns:pic="http://schemas.openxmlformats.org/drawingml/2006/picture">
                   <pic:nvPicPr>
                     <pic:cNvPr id="1358854278" name="Picture 1" descr="A screenshot of a computer&#10;&#10;AI-generated content may be incorrect."/>
-                    <pic:cNvPicPr/>
-                  </pic:nvPicPr>
-                  <pic:blipFill>
-                    <a:blip r:embed="rId10" cstate="print">
-                      <a:extLst>
-                        <a:ext uri="{28A0092B-C50C-407E-A947-70E740481C1C}">
-                          <a14:useLocalDpi xmlns:a14="http://schemas.microsoft.com/office/drawing/2010/main" val="0"/>
-                        </a:ext>
-                      </a:extLst>
-                    </a:blip>
-                    <a:stretch>
-                      <a:fillRect/>
-                    </a:stretch>
-                  </pic:blipFill>
-                  <pic:spPr>
-                    <a:xfrm>
-                      <a:off x="0" y="0"/>
-                      <a:ext cx="5731510" cy="3515360"/>
-                    </a:xfrm>
-                    <a:prstGeom prst="rect">
-                      <a:avLst/>
-                    </a:prstGeom>
-                  </pic:spPr>
-                </pic:pic>
-              </a:graphicData>
-            </a:graphic>
-          </wp:inline>
-        </w:drawing>
-      </w:r>
-    </w:p>
-    <w:p>
-      <w:pPr>
-        <w:jc w:val="both"/>
-        <w:rPr>
-          <w:sz w:val="44"/>
-          <w:szCs w:val="44"/>
-          <w:u w:val="single"/>
-        </w:rPr>
-      </w:pPr>
-      <w:r>
-        <w:rPr>
-          <w:noProof/>
-          <w:sz w:val="44"/>
-          <w:szCs w:val="44"/>
-          <w:u w:val="single"/>
-        </w:rPr>
-        <w:drawing>
-          <wp:inline distT="0" distB="0" distL="0" distR="0" wp14:anchorId="25B0E26C" wp14:editId="76FE6A32">
-            <wp:extent cx="5731510" cy="3515360"/>
-            <wp:effectExtent l="0" t="0" r="0" b="2540"/>
-            <wp:docPr id="1045244538" name="Picture 2" descr="A screenshot of a computer&#10;&#10;AI-generated content may be incorrect."/>
-            <wp:cNvGraphicFramePr>
-              <a:graphicFrameLocks xmlns:a="http://schemas.openxmlformats.org/drawingml/2006/main" noChangeAspect="1"/>
-            </wp:cNvGraphicFramePr>
-            <a:graphic xmlns:a="http://schemas.openxmlformats.org/drawingml/2006/main">
-              <a:graphicData uri="http://schemas.openxmlformats.org/drawingml/2006/picture">
-                <pic:pic xmlns:pic="http://schemas.openxmlformats.org/drawingml/2006/picture">
-                  <pic:nvPicPr>
-                    <pic:cNvPr id="1045244538" name="Picture 2" descr="A screenshot of a computer&#10;&#10;AI-generated content may be incorrect."/>
                     <pic:cNvPicPr/>
                   </pic:nvPicPr>
                   <pic:blipFill>
@@ -802,6 +743,65 @@
           <w:u w:val="single"/>
         </w:rPr>
       </w:pPr>
+      <w:r>
+        <w:rPr>
+          <w:noProof/>
+          <w:sz w:val="44"/>
+          <w:szCs w:val="44"/>
+          <w:u w:val="single"/>
+        </w:rPr>
+        <w:drawing>
+          <wp:inline distT="0" distB="0" distL="0" distR="0" wp14:anchorId="25B0E26C" wp14:editId="76FE6A32">
+            <wp:extent cx="5731510" cy="3515360"/>
+            <wp:effectExtent l="0" t="0" r="0" b="2540"/>
+            <wp:docPr id="1045244538" name="Picture 2" descr="A screenshot of a computer&#10;&#10;AI-generated content may be incorrect."/>
+            <wp:cNvGraphicFramePr>
+              <a:graphicFrameLocks xmlns:a="http://schemas.openxmlformats.org/drawingml/2006/main" noChangeAspect="1"/>
+            </wp:cNvGraphicFramePr>
+            <a:graphic xmlns:a="http://schemas.openxmlformats.org/drawingml/2006/main">
+              <a:graphicData uri="http://schemas.openxmlformats.org/drawingml/2006/picture">
+                <pic:pic xmlns:pic="http://schemas.openxmlformats.org/drawingml/2006/picture">
+                  <pic:nvPicPr>
+                    <pic:cNvPr id="1045244538" name="Picture 2" descr="A screenshot of a computer&#10;&#10;AI-generated content may be incorrect."/>
+                    <pic:cNvPicPr/>
+                  </pic:nvPicPr>
+                  <pic:blipFill>
+                    <a:blip r:embed="rId12" cstate="print">
+                      <a:extLst>
+                        <a:ext uri="{28A0092B-C50C-407E-A947-70E740481C1C}">
+                          <a14:useLocalDpi xmlns:a14="http://schemas.microsoft.com/office/drawing/2010/main" val="0"/>
+                        </a:ext>
+                      </a:extLst>
+                    </a:blip>
+                    <a:stretch>
+                      <a:fillRect/>
+                    </a:stretch>
+                  </pic:blipFill>
+                  <pic:spPr>
+                    <a:xfrm>
+                      <a:off x="0" y="0"/>
+                      <a:ext cx="5731510" cy="3515360"/>
+                    </a:xfrm>
+                    <a:prstGeom prst="rect">
+                      <a:avLst/>
+                    </a:prstGeom>
+                  </pic:spPr>
+                </pic:pic>
+              </a:graphicData>
+            </a:graphic>
+          </wp:inline>
+        </w:drawing>
+      </w:r>
+    </w:p>
+    <w:p>
+      <w:pPr>
+        <w:jc w:val="both"/>
+        <w:rPr>
+          <w:sz w:val="44"/>
+          <w:szCs w:val="44"/>
+          <w:u w:val="single"/>
+        </w:rPr>
+      </w:pPr>
     </w:p>
     <w:p>
       <w:pPr>
@@ -908,7 +908,7 @@
           <w:noProof/>
         </w:rPr>
         <w:drawing>
-          <wp:inline distT="0" distB="0" distL="0" distR="0" wp14:anchorId="0CC855C4" wp14:editId="5334706D">
+          <wp:inline distT="0" distB="0" distL="0" distR="0" wp14:anchorId="0CC855C4" wp14:editId="7799A94F">
             <wp:extent cx="5731510" cy="4110355"/>
             <wp:effectExtent l="0" t="0" r="0" b="4445"/>
             <wp:docPr id="427495545" name="Picture 1" descr="A screenshot of a computer program&#10;&#10;AI-generated content may be incorrect."/>
@@ -923,7 +923,7 @@
                     <pic:cNvPicPr/>
                   </pic:nvPicPr>
                   <pic:blipFill>
-                    <a:blip r:embed="rId12" cstate="print">
+                    <a:blip r:embed="rId13" cstate="print">
                       <a:extLst>
                         <a:ext uri="{28A0092B-C50C-407E-A947-70E740481C1C}">
                           <a14:useLocalDpi xmlns:a14="http://schemas.microsoft.com/office/drawing/2010/main" val="0"/>
@@ -983,7 +983,7 @@
                     <pic:cNvPicPr/>
                   </pic:nvPicPr>
                   <pic:blipFill>
-                    <a:blip r:embed="rId13" cstate="print">
+                    <a:blip r:embed="rId14" cstate="print">
                       <a:extLst>
                         <a:ext uri="{28A0092B-C50C-407E-A947-70E740481C1C}">
                           <a14:useLocalDpi xmlns:a14="http://schemas.microsoft.com/office/drawing/2010/main" val="0"/>
@@ -1176,7 +1176,7 @@
                     <pic:cNvPicPr/>
                   </pic:nvPicPr>
                   <pic:blipFill>
-                    <a:blip r:embed="rId14" cstate="print">
+                    <a:blip r:embed="rId15" cstate="print">
                       <a:extLst>
                         <a:ext uri="{28A0092B-C50C-407E-A947-70E740481C1C}">
                           <a14:useLocalDpi xmlns:a14="http://schemas.microsoft.com/office/drawing/2010/main" val="0"/>
@@ -1245,7 +1245,7 @@
                     <pic:cNvPicPr/>
                   </pic:nvPicPr>
                   <pic:blipFill>
-                    <a:blip r:embed="rId15" cstate="print">
+                    <a:blip r:embed="rId16" cstate="print">
                       <a:extLst>
                         <a:ext uri="{28A0092B-C50C-407E-A947-70E740481C1C}">
                           <a14:useLocalDpi xmlns:a14="http://schemas.microsoft.com/office/drawing/2010/main" val="0"/>
@@ -1305,7 +1305,7 @@
                     <pic:cNvPicPr/>
                   </pic:nvPicPr>
                   <pic:blipFill>
-                    <a:blip r:embed="rId16" cstate="print">
+                    <a:blip r:embed="rId17" cstate="print">
                       <a:extLst>
                         <a:ext uri="{28A0092B-C50C-407E-A947-70E740481C1C}">
                           <a14:useLocalDpi xmlns:a14="http://schemas.microsoft.com/office/drawing/2010/main" val="0"/>
@@ -1457,7 +1457,7 @@
                     <pic:cNvPicPr/>
                   </pic:nvPicPr>
                   <pic:blipFill>
-                    <a:blip r:embed="rId17" cstate="print">
+                    <a:blip r:embed="rId18" cstate="print">
                       <a:extLst>
                         <a:ext uri="{28A0092B-C50C-407E-A947-70E740481C1C}">
                           <a14:useLocalDpi xmlns:a14="http://schemas.microsoft.com/office/drawing/2010/main" val="0"/>
@@ -1574,7 +1574,7 @@
         </w:rPr>
         <w:lastRenderedPageBreak/>
         <w:drawing>
-          <wp:inline distT="0" distB="0" distL="0" distR="0" wp14:anchorId="49C2E09F" wp14:editId="02781118">
+          <wp:inline distT="0" distB="0" distL="0" distR="0" wp14:anchorId="49C2E09F" wp14:editId="413DB6C6">
             <wp:extent cx="5731510" cy="5094605"/>
             <wp:effectExtent l="0" t="0" r="0" b="0"/>
             <wp:docPr id="933085977" name="Picture 14" descr="A screenshot of a computer program&#10;&#10;AI-generated content may be incorrect."/>
@@ -1589,7 +1589,7 @@
                     <pic:cNvPicPr/>
                   </pic:nvPicPr>
                   <pic:blipFill>
-                    <a:blip r:embed="rId18" cstate="print">
+                    <a:blip r:embed="rId19" cstate="print">
                       <a:extLst>
                         <a:ext uri="{28A0092B-C50C-407E-A947-70E740481C1C}">
                           <a14:useLocalDpi xmlns:a14="http://schemas.microsoft.com/office/drawing/2010/main" val="0"/>
@@ -1634,7 +1634,7 @@
         </w:rPr>
         <w:lastRenderedPageBreak/>
         <w:drawing>
-          <wp:inline distT="0" distB="0" distL="0" distR="0" wp14:anchorId="00EEDDBA" wp14:editId="3E3E98C8">
+          <wp:inline distT="0" distB="0" distL="0" distR="0" wp14:anchorId="00EEDDBA" wp14:editId="0987FE91">
             <wp:extent cx="5731510" cy="4947920"/>
             <wp:effectExtent l="0" t="0" r="0" b="5080"/>
             <wp:docPr id="1420891525" name="Picture 12" descr="A screenshot of a computer program&#10;&#10;AI-generated content may be incorrect."/>
@@ -1649,7 +1649,7 @@
                     <pic:cNvPicPr/>
                   </pic:nvPicPr>
                   <pic:blipFill>
-                    <a:blip r:embed="rId19" cstate="print">
+                    <a:blip r:embed="rId20" cstate="print">
                       <a:extLst>
                         <a:ext uri="{28A0092B-C50C-407E-A947-70E740481C1C}">
                           <a14:useLocalDpi xmlns:a14="http://schemas.microsoft.com/office/drawing/2010/main" val="0"/>
@@ -1683,7 +1683,7 @@
           <w:u w:val="single"/>
         </w:rPr>
         <w:drawing>
-          <wp:inline distT="0" distB="0" distL="0" distR="0" wp14:anchorId="0A8DDDD0" wp14:editId="2489318C">
+          <wp:inline distT="0" distB="0" distL="0" distR="0" wp14:anchorId="0A8DDDD0" wp14:editId="13BE607B">
             <wp:extent cx="5731510" cy="3519170"/>
             <wp:effectExtent l="0" t="0" r="0" b="0"/>
             <wp:docPr id="767667422" name="Picture 13" descr="A computer screen shot of text&#10;&#10;AI-generated content may be incorrect."/>
@@ -1698,7 +1698,7 @@
                     <pic:cNvPicPr/>
                   </pic:nvPicPr>
                   <pic:blipFill>
-                    <a:blip r:embed="rId20" cstate="print">
+                    <a:blip r:embed="rId21" cstate="print">
                       <a:extLst>
                         <a:ext uri="{28A0092B-C50C-407E-A947-70E740481C1C}">
                           <a14:useLocalDpi xmlns:a14="http://schemas.microsoft.com/office/drawing/2010/main" val="0"/>
@@ -1758,7 +1758,7 @@
                     <pic:cNvPicPr/>
                   </pic:nvPicPr>
                   <pic:blipFill>
-                    <a:blip r:embed="rId21" cstate="print">
+                    <a:blip r:embed="rId22" cstate="print">
                       <a:extLst>
                         <a:ext uri="{28A0092B-C50C-407E-A947-70E740481C1C}">
                           <a14:useLocalDpi xmlns:a14="http://schemas.microsoft.com/office/drawing/2010/main" val="0"/>
@@ -1817,7 +1817,7 @@
                     <pic:cNvPicPr/>
                   </pic:nvPicPr>
                   <pic:blipFill>
-                    <a:blip r:embed="rId22" cstate="print">
+                    <a:blip r:embed="rId23" cstate="print">
                       <a:extLst>
                         <a:ext uri="{28A0092B-C50C-407E-A947-70E740481C1C}">
                           <a14:useLocalDpi xmlns:a14="http://schemas.microsoft.com/office/drawing/2010/main" val="0"/>
@@ -1877,7 +1877,7 @@
                     <pic:cNvPicPr/>
                   </pic:nvPicPr>
                   <pic:blipFill>
-                    <a:blip r:embed="rId23" cstate="print">
+                    <a:blip r:embed="rId24" cstate="print">
                       <a:extLst>
                         <a:ext uri="{28A0092B-C50C-407E-A947-70E740481C1C}">
                           <a14:useLocalDpi xmlns:a14="http://schemas.microsoft.com/office/drawing/2010/main" val="0"/>
@@ -2042,63 +2042,6 @@
                 <pic:pic xmlns:pic="http://schemas.openxmlformats.org/drawingml/2006/picture">
                   <pic:nvPicPr>
                     <pic:cNvPr id="2119741958" name="Picture 5" descr="A screen shot of a computer&#10;&#10;AI-generated content may be incorrect."/>
-                    <pic:cNvPicPr/>
-                  </pic:nvPicPr>
-                  <pic:blipFill>
-                    <a:blip r:embed="rId24" cstate="print">
-                      <a:extLst>
-                        <a:ext uri="{28A0092B-C50C-407E-A947-70E740481C1C}">
-                          <a14:useLocalDpi xmlns:a14="http://schemas.microsoft.com/office/drawing/2010/main" val="0"/>
-                        </a:ext>
-                      </a:extLst>
-                    </a:blip>
-                    <a:stretch>
-                      <a:fillRect/>
-                    </a:stretch>
-                  </pic:blipFill>
-                  <pic:spPr>
-                    <a:xfrm>
-                      <a:off x="0" y="0"/>
-                      <a:ext cx="5731510" cy="2953385"/>
-                    </a:xfrm>
-                    <a:prstGeom prst="rect">
-                      <a:avLst/>
-                    </a:prstGeom>
-                  </pic:spPr>
-                </pic:pic>
-              </a:graphicData>
-            </a:graphic>
-          </wp:inline>
-        </w:drawing>
-      </w:r>
-    </w:p>
-    <w:p>
-      <w:pPr>
-        <w:jc w:val="both"/>
-        <w:rPr>
-          <w:sz w:val="44"/>
-          <w:szCs w:val="44"/>
-        </w:rPr>
-      </w:pPr>
-      <w:r>
-        <w:rPr>
-          <w:noProof/>
-          <w:sz w:val="44"/>
-          <w:szCs w:val="44"/>
-        </w:rPr>
-        <w:drawing>
-          <wp:inline distT="0" distB="0" distL="0" distR="0" wp14:anchorId="29468091" wp14:editId="76A72DE8">
-            <wp:extent cx="5731510" cy="2953385"/>
-            <wp:effectExtent l="0" t="0" r="0" b="5715"/>
-            <wp:docPr id="1727545167" name="Picture 6" descr="A screenshot of a computer&#10;&#10;AI-generated content may be incorrect."/>
-            <wp:cNvGraphicFramePr>
-              <a:graphicFrameLocks xmlns:a="http://schemas.openxmlformats.org/drawingml/2006/main" noChangeAspect="1"/>
-            </wp:cNvGraphicFramePr>
-            <a:graphic xmlns:a="http://schemas.openxmlformats.org/drawingml/2006/main">
-              <a:graphicData uri="http://schemas.openxmlformats.org/drawingml/2006/picture">
-                <pic:pic xmlns:pic="http://schemas.openxmlformats.org/drawingml/2006/picture">
-                  <pic:nvPicPr>
-                    <pic:cNvPr id="1727545167" name="Picture 6" descr="A screenshot of a computer&#10;&#10;AI-generated content may be incorrect."/>
                     <pic:cNvPicPr/>
                   </pic:nvPicPr>
                   <pic:blipFill>
@@ -2143,12 +2086,11 @@
           <w:sz w:val="44"/>
           <w:szCs w:val="44"/>
         </w:rPr>
-        <w:lastRenderedPageBreak/>
         <w:drawing>
-          <wp:inline distT="0" distB="0" distL="0" distR="0" wp14:anchorId="3699C3A8" wp14:editId="280ADA05">
+          <wp:inline distT="0" distB="0" distL="0" distR="0" wp14:anchorId="29468091" wp14:editId="76A72DE8">
             <wp:extent cx="5731510" cy="2953385"/>
             <wp:effectExtent l="0" t="0" r="0" b="5715"/>
-            <wp:docPr id="470462795" name="Picture 8" descr="A screenshot of a graph&#10;&#10;AI-generated content may be incorrect."/>
+            <wp:docPr id="1727545167" name="Picture 6" descr="A screenshot of a computer&#10;&#10;AI-generated content may be incorrect."/>
             <wp:cNvGraphicFramePr>
               <a:graphicFrameLocks xmlns:a="http://schemas.openxmlformats.org/drawingml/2006/main" noChangeAspect="1"/>
             </wp:cNvGraphicFramePr>
@@ -2156,7 +2098,7 @@
               <a:graphicData uri="http://schemas.openxmlformats.org/drawingml/2006/picture">
                 <pic:pic xmlns:pic="http://schemas.openxmlformats.org/drawingml/2006/picture">
                   <pic:nvPicPr>
-                    <pic:cNvPr id="470462795" name="Picture 8" descr="A screenshot of a graph&#10;&#10;AI-generated content may be incorrect."/>
+                    <pic:cNvPr id="1727545167" name="Picture 6" descr="A screenshot of a computer&#10;&#10;AI-generated content may be incorrect."/>
                     <pic:cNvPicPr/>
                   </pic:nvPicPr>
                   <pic:blipFill>
@@ -2189,6 +2131,64 @@
     </w:p>
     <w:p>
       <w:pPr>
+        <w:jc w:val="both"/>
+        <w:rPr>
+          <w:sz w:val="44"/>
+          <w:szCs w:val="44"/>
+        </w:rPr>
+      </w:pPr>
+      <w:r>
+        <w:rPr>
+          <w:noProof/>
+          <w:sz w:val="44"/>
+          <w:szCs w:val="44"/>
+        </w:rPr>
+        <w:lastRenderedPageBreak/>
+        <w:drawing>
+          <wp:inline distT="0" distB="0" distL="0" distR="0" wp14:anchorId="3699C3A8" wp14:editId="280ADA05">
+            <wp:extent cx="5731510" cy="2953385"/>
+            <wp:effectExtent l="0" t="0" r="0" b="5715"/>
+            <wp:docPr id="470462795" name="Picture 8" descr="A screenshot of a graph&#10;&#10;AI-generated content may be incorrect."/>
+            <wp:cNvGraphicFramePr>
+              <a:graphicFrameLocks xmlns:a="http://schemas.openxmlformats.org/drawingml/2006/main" noChangeAspect="1"/>
+            </wp:cNvGraphicFramePr>
+            <a:graphic xmlns:a="http://schemas.openxmlformats.org/drawingml/2006/main">
+              <a:graphicData uri="http://schemas.openxmlformats.org/drawingml/2006/picture">
+                <pic:pic xmlns:pic="http://schemas.openxmlformats.org/drawingml/2006/picture">
+                  <pic:nvPicPr>
+                    <pic:cNvPr id="470462795" name="Picture 8" descr="A screenshot of a graph&#10;&#10;AI-generated content may be incorrect."/>
+                    <pic:cNvPicPr/>
+                  </pic:nvPicPr>
+                  <pic:blipFill>
+                    <a:blip r:embed="rId27" cstate="print">
+                      <a:extLst>
+                        <a:ext uri="{28A0092B-C50C-407E-A947-70E740481C1C}">
+                          <a14:useLocalDpi xmlns:a14="http://schemas.microsoft.com/office/drawing/2010/main" val="0"/>
+                        </a:ext>
+                      </a:extLst>
+                    </a:blip>
+                    <a:stretch>
+                      <a:fillRect/>
+                    </a:stretch>
+                  </pic:blipFill>
+                  <pic:spPr>
+                    <a:xfrm>
+                      <a:off x="0" y="0"/>
+                      <a:ext cx="5731510" cy="2953385"/>
+                    </a:xfrm>
+                    <a:prstGeom prst="rect">
+                      <a:avLst/>
+                    </a:prstGeom>
+                  </pic:spPr>
+                </pic:pic>
+              </a:graphicData>
+            </a:graphic>
+          </wp:inline>
+        </w:drawing>
+      </w:r>
+    </w:p>
+    <w:p>
+      <w:pPr>
         <w:rPr>
           <w:sz w:val="36"/>
           <w:szCs w:val="36"/>
@@ -2229,14 +2229,7 @@
           <w:sz w:val="36"/>
           <w:szCs w:val="36"/>
         </w:rPr>
-        <w:t>Added those LSTM metrics to the existing model comparison chart so it sits next to Random Forest, Logistic Regression, and MLP.</w:t>
-      </w:r>
-      <w:r>
-        <w:rPr>
-          <w:sz w:val="36"/>
-          <w:szCs w:val="36"/>
-        </w:rPr>
-        <w:t>–</w:t>
+        <w:t>Added those LSTM metrics to the existing model comparison chart so it sits next to Random Forest, Logistic Regression, and MLP</w:t>
       </w:r>
     </w:p>
     <w:p>
@@ -2265,6 +2258,87 @@
         </w:rPr>
         <w:t>Lab 12</w:t>
       </w:r>
+    </w:p>
+    <w:p>
+      <w:pPr>
+        <w:jc w:val="both"/>
+        <w:rPr>
+          <w:sz w:val="44"/>
+          <w:szCs w:val="44"/>
+          <w:u w:val="single"/>
+        </w:rPr>
+      </w:pPr>
+    </w:p>
+    <w:p>
+      <w:pPr>
+        <w:rPr>
+          <w:sz w:val="44"/>
+          <w:szCs w:val="44"/>
+          <w:u w:val="single"/>
+        </w:rPr>
+      </w:pPr>
+      <w:r>
+        <w:rPr>
+          <w:sz w:val="44"/>
+          <w:szCs w:val="44"/>
+          <w:u w:val="single"/>
+        </w:rPr>
+        <w:t>GitHub Repository (Practical Exercises)</w:t>
+      </w:r>
+    </w:p>
+    <w:p>
+      <w:pPr>
+        <w:rPr>
+          <w:sz w:val="36"/>
+          <w:szCs w:val="36"/>
+          <w:lang w:eastAsia="en-GB"/>
+        </w:rPr>
+      </w:pPr>
+      <w:r>
+        <w:rPr>
+          <w:sz w:val="36"/>
+          <w:szCs w:val="36"/>
+          <w:lang w:eastAsia="en-GB"/>
+        </w:rPr>
+        <w:t>GitHub repository containing all weekly practical exercises and lab notebooks:</w:t>
+      </w:r>
+    </w:p>
+    <w:p>
+      <w:pPr>
+        <w:rPr>
+          <w:sz w:val="40"/>
+          <w:szCs w:val="40"/>
+        </w:rPr>
+      </w:pPr>
+      <w:hyperlink r:id="rId28" w:history="1">
+        <w:r>
+          <w:rPr>
+            <w:rStyle w:val="Hyperlink"/>
+            <w:sz w:val="36"/>
+            <w:szCs w:val="36"/>
+            <w:lang w:eastAsia="en-GB"/>
+          </w:rPr>
+          <w:t>https://github.com/ranselorm/ML-in-Fi</w:t>
+        </w:r>
+        <w:r>
+          <w:rPr>
+            <w:rStyle w:val="Hyperlink"/>
+            <w:sz w:val="36"/>
+            <w:szCs w:val="36"/>
+            <w:lang w:eastAsia="en-GB"/>
+          </w:rPr>
+          <w:t>n</w:t>
+        </w:r>
+        <w:r>
+          <w:rPr>
+            <w:rStyle w:val="Hyperlink"/>
+            <w:sz w:val="36"/>
+            <w:szCs w:val="36"/>
+            <w:lang w:eastAsia="en-GB"/>
+          </w:rPr>
+          <w:t>ance-Labs</w:t>
+        </w:r>
+      </w:hyperlink>
     </w:p>
     <w:p>
       <w:pPr>
@@ -2284,6 +2358,315 @@
     </w:sectPr>
   </w:body>
 </w:document>
+</file>
+
+<file path=word/numbering.xml><?xml version="1.0" encoding="utf-8"?>
+<w:numbering xmlns:wpc="http://schemas.microsoft.com/office/word/2010/wordprocessingCanvas" xmlns:cx="http://schemas.microsoft.com/office/drawing/2014/chartex" xmlns:cx1="http://schemas.microsoft.com/office/drawing/2015/9/8/chartex" xmlns:cx2="http://schemas.microsoft.com/office/drawing/2015/10/21/chartex" xmlns:cx3="http://schemas.microsoft.com/office/drawing/2016/5/9/chartex" xmlns:cx4="http://schemas.microsoft.com/office/drawing/2016/5/10/chartex" xmlns:cx5="http://schemas.microsoft.com/office/drawing/2016/5/11/chartex" xmlns:cx6="http://schemas.microsoft.com/office/drawing/2016/5/12/chartex" xmlns:cx7="http://schemas.microsoft.com/office/drawing/2016/5/13/chartex" xmlns:cx8="http://schemas.microsoft.com/office/drawing/2016/5/14/chartex" xmlns:mc="http://schemas.openxmlformats.org/markup-compatibility/2006" xmlns:aink="http://schemas.microsoft.com/office/drawing/2016/ink" xmlns:am3d="http://schemas.microsoft.com/office/drawing/2017/model3d" xmlns:o="urn:schemas-microsoft-com:office:office" xmlns:oel="http://schemas.microsoft.com/office/2019/extlst" xmlns:r="http://schemas.openxmlformats.org/officeDocument/2006/relationships" xmlns:m="http://schemas.openxmlformats.org/officeDocument/2006/math" xmlns:v="urn:schemas-microsoft-com:vml" xmlns:wp14="http://schemas.microsoft.com/office/word/2010/wordprocessingDrawing" xmlns:wp="http://schemas.openxmlformats.org/drawingml/2006/wordprocessingDrawing" xmlns:w10="urn:schemas-microsoft-com:office:word" xmlns:w="http://schemas.openxmlformats.org/wordprocessingml/2006/main" xmlns:w14="http://schemas.microsoft.com/office/word/2010/wordml" xmlns:w15="http://schemas.microsoft.com/office/word/2012/wordml" xmlns:w16cex="http://schemas.microsoft.com/office/word/2018/wordml/cex" xmlns:w16cid="http://schemas.microsoft.com/office/word/2016/wordml/cid" xmlns:w16="http://schemas.microsoft.com/office/word/2018/wordml" xmlns:w16du="http://schemas.microsoft.com/office/word/2023/wordml/word16du" xmlns:w16sdtdh="http://schemas.microsoft.com/office/word/2020/wordml/sdtdatahash" xmlns:w16sdtfl="http://schemas.microsoft.com/office/word/2024/wordml/sdtformatlock" xmlns:w16se="http://schemas.microsoft.com/office/word/2015/wordml/symex" xmlns:wpg="http://schemas.microsoft.com/office/word/2010/wordprocessingGroup" xmlns:wpi="http://schemas.microsoft.com/office/word/2010/wordprocessingInk" xmlns:wne="http://schemas.microsoft.com/office/word/2006/wordml" xmlns:wps="http://schemas.microsoft.com/office/word/2010/wordprocessingShape" mc:Ignorable="w14 w15 w16se w16cid w16 w16cex w16sdtdh w16sdtfl w16du wp14">
+  <w:abstractNum w:abstractNumId="0" w15:restartNumberingAfterBreak="0">
+    <w:nsid w:val="1AB01276"/>
+    <w:multiLevelType w:val="multilevel"/>
+    <w:tmpl w:val="BBB0FD56"/>
+    <w:lvl w:ilvl="0">
+      <w:start w:val="1"/>
+      <w:numFmt w:val="bullet"/>
+      <w:lvlText w:val=""/>
+      <w:lvlJc w:val="left"/>
+      <w:pPr>
+        <w:tabs>
+          <w:tab w:val="num" w:pos="720"/>
+        </w:tabs>
+        <w:ind w:left="720" w:hanging="360"/>
+      </w:pPr>
+      <w:rPr>
+        <w:rFonts w:ascii="Symbol" w:hAnsi="Symbol" w:hint="default"/>
+        <w:sz w:val="20"/>
+      </w:rPr>
+    </w:lvl>
+    <w:lvl w:ilvl="1" w:tentative="1">
+      <w:start w:val="1"/>
+      <w:numFmt w:val="bullet"/>
+      <w:lvlText w:val="o"/>
+      <w:lvlJc w:val="left"/>
+      <w:pPr>
+        <w:tabs>
+          <w:tab w:val="num" w:pos="1440"/>
+        </w:tabs>
+        <w:ind w:left="1440" w:hanging="360"/>
+      </w:pPr>
+      <w:rPr>
+        <w:rFonts w:ascii="Courier New" w:hAnsi="Courier New" w:hint="default"/>
+        <w:sz w:val="20"/>
+      </w:rPr>
+    </w:lvl>
+    <w:lvl w:ilvl="2" w:tentative="1">
+      <w:start w:val="1"/>
+      <w:numFmt w:val="bullet"/>
+      <w:lvlText w:val=""/>
+      <w:lvlJc w:val="left"/>
+      <w:pPr>
+        <w:tabs>
+          <w:tab w:val="num" w:pos="2160"/>
+        </w:tabs>
+        <w:ind w:left="2160" w:hanging="360"/>
+      </w:pPr>
+      <w:rPr>
+        <w:rFonts w:ascii="Wingdings" w:hAnsi="Wingdings" w:hint="default"/>
+        <w:sz w:val="20"/>
+      </w:rPr>
+    </w:lvl>
+    <w:lvl w:ilvl="3" w:tentative="1">
+      <w:start w:val="1"/>
+      <w:numFmt w:val="bullet"/>
+      <w:lvlText w:val=""/>
+      <w:lvlJc w:val="left"/>
+      <w:pPr>
+        <w:tabs>
+          <w:tab w:val="num" w:pos="2880"/>
+        </w:tabs>
+        <w:ind w:left="2880" w:hanging="360"/>
+      </w:pPr>
+      <w:rPr>
+        <w:rFonts w:ascii="Wingdings" w:hAnsi="Wingdings" w:hint="default"/>
+        <w:sz w:val="20"/>
+      </w:rPr>
+    </w:lvl>
+    <w:lvl w:ilvl="4" w:tentative="1">
+      <w:start w:val="1"/>
+      <w:numFmt w:val="bullet"/>
+      <w:lvlText w:val=""/>
+      <w:lvlJc w:val="left"/>
+      <w:pPr>
+        <w:tabs>
+          <w:tab w:val="num" w:pos="3600"/>
+        </w:tabs>
+        <w:ind w:left="3600" w:hanging="360"/>
+      </w:pPr>
+      <w:rPr>
+        <w:rFonts w:ascii="Wingdings" w:hAnsi="Wingdings" w:hint="default"/>
+        <w:sz w:val="20"/>
+      </w:rPr>
+    </w:lvl>
+    <w:lvl w:ilvl="5" w:tentative="1">
+      <w:start w:val="1"/>
+      <w:numFmt w:val="bullet"/>
+      <w:lvlText w:val=""/>
+      <w:lvlJc w:val="left"/>
+      <w:pPr>
+        <w:tabs>
+          <w:tab w:val="num" w:pos="4320"/>
+        </w:tabs>
+        <w:ind w:left="4320" w:hanging="360"/>
+      </w:pPr>
+      <w:rPr>
+        <w:rFonts w:ascii="Wingdings" w:hAnsi="Wingdings" w:hint="default"/>
+        <w:sz w:val="20"/>
+      </w:rPr>
+    </w:lvl>
+    <w:lvl w:ilvl="6" w:tentative="1">
+      <w:start w:val="1"/>
+      <w:numFmt w:val="bullet"/>
+      <w:lvlText w:val=""/>
+      <w:lvlJc w:val="left"/>
+      <w:pPr>
+        <w:tabs>
+          <w:tab w:val="num" w:pos="5040"/>
+        </w:tabs>
+        <w:ind w:left="5040" w:hanging="360"/>
+      </w:pPr>
+      <w:rPr>
+        <w:rFonts w:ascii="Wingdings" w:hAnsi="Wingdings" w:hint="default"/>
+        <w:sz w:val="20"/>
+      </w:rPr>
+    </w:lvl>
+    <w:lvl w:ilvl="7" w:tentative="1">
+      <w:start w:val="1"/>
+      <w:numFmt w:val="bullet"/>
+      <w:lvlText w:val=""/>
+      <w:lvlJc w:val="left"/>
+      <w:pPr>
+        <w:tabs>
+          <w:tab w:val="num" w:pos="5760"/>
+        </w:tabs>
+        <w:ind w:left="5760" w:hanging="360"/>
+      </w:pPr>
+      <w:rPr>
+        <w:rFonts w:ascii="Wingdings" w:hAnsi="Wingdings" w:hint="default"/>
+        <w:sz w:val="20"/>
+      </w:rPr>
+    </w:lvl>
+    <w:lvl w:ilvl="8" w:tentative="1">
+      <w:start w:val="1"/>
+      <w:numFmt w:val="bullet"/>
+      <w:lvlText w:val=""/>
+      <w:lvlJc w:val="left"/>
+      <w:pPr>
+        <w:tabs>
+          <w:tab w:val="num" w:pos="6480"/>
+        </w:tabs>
+        <w:ind w:left="6480" w:hanging="360"/>
+      </w:pPr>
+      <w:rPr>
+        <w:rFonts w:ascii="Wingdings" w:hAnsi="Wingdings" w:hint="default"/>
+        <w:sz w:val="20"/>
+      </w:rPr>
+    </w:lvl>
+  </w:abstractNum>
+  <w:abstractNum w:abstractNumId="1" w15:restartNumberingAfterBreak="0">
+    <w:nsid w:val="5CD3588D"/>
+    <w:multiLevelType w:val="multilevel"/>
+    <w:tmpl w:val="B9069FA2"/>
+    <w:lvl w:ilvl="0">
+      <w:start w:val="1"/>
+      <w:numFmt w:val="bullet"/>
+      <w:lvlText w:val=""/>
+      <w:lvlJc w:val="left"/>
+      <w:pPr>
+        <w:tabs>
+          <w:tab w:val="num" w:pos="720"/>
+        </w:tabs>
+        <w:ind w:left="720" w:hanging="360"/>
+      </w:pPr>
+      <w:rPr>
+        <w:rFonts w:ascii="Symbol" w:hAnsi="Symbol" w:hint="default"/>
+        <w:sz w:val="20"/>
+      </w:rPr>
+    </w:lvl>
+    <w:lvl w:ilvl="1" w:tentative="1">
+      <w:start w:val="1"/>
+      <w:numFmt w:val="bullet"/>
+      <w:lvlText w:val="o"/>
+      <w:lvlJc w:val="left"/>
+      <w:pPr>
+        <w:tabs>
+          <w:tab w:val="num" w:pos="1440"/>
+        </w:tabs>
+        <w:ind w:left="1440" w:hanging="360"/>
+      </w:pPr>
+      <w:rPr>
+        <w:rFonts w:ascii="Courier New" w:hAnsi="Courier New" w:hint="default"/>
+        <w:sz w:val="20"/>
+      </w:rPr>
+    </w:lvl>
+    <w:lvl w:ilvl="2" w:tentative="1">
+      <w:start w:val="1"/>
+      <w:numFmt w:val="bullet"/>
+      <w:lvlText w:val=""/>
+      <w:lvlJc w:val="left"/>
+      <w:pPr>
+        <w:tabs>
+          <w:tab w:val="num" w:pos="2160"/>
+        </w:tabs>
+        <w:ind w:left="2160" w:hanging="360"/>
+      </w:pPr>
+      <w:rPr>
+        <w:rFonts w:ascii="Wingdings" w:hAnsi="Wingdings" w:hint="default"/>
+        <w:sz w:val="20"/>
+      </w:rPr>
+    </w:lvl>
+    <w:lvl w:ilvl="3" w:tentative="1">
+      <w:start w:val="1"/>
+      <w:numFmt w:val="bullet"/>
+      <w:lvlText w:val=""/>
+      <w:lvlJc w:val="left"/>
+      <w:pPr>
+        <w:tabs>
+          <w:tab w:val="num" w:pos="2880"/>
+        </w:tabs>
+        <w:ind w:left="2880" w:hanging="360"/>
+      </w:pPr>
+      <w:rPr>
+        <w:rFonts w:ascii="Wingdings" w:hAnsi="Wingdings" w:hint="default"/>
+        <w:sz w:val="20"/>
+      </w:rPr>
+    </w:lvl>
+    <w:lvl w:ilvl="4" w:tentative="1">
+      <w:start w:val="1"/>
+      <w:numFmt w:val="bullet"/>
+      <w:lvlText w:val=""/>
+      <w:lvlJc w:val="left"/>
+      <w:pPr>
+        <w:tabs>
+          <w:tab w:val="num" w:pos="3600"/>
+        </w:tabs>
+        <w:ind w:left="3600" w:hanging="360"/>
+      </w:pPr>
+      <w:rPr>
+        <w:rFonts w:ascii="Wingdings" w:hAnsi="Wingdings" w:hint="default"/>
+        <w:sz w:val="20"/>
+      </w:rPr>
+    </w:lvl>
+    <w:lvl w:ilvl="5" w:tentative="1">
+      <w:start w:val="1"/>
+      <w:numFmt w:val="bullet"/>
+      <w:lvlText w:val=""/>
+      <w:lvlJc w:val="left"/>
+      <w:pPr>
+        <w:tabs>
+          <w:tab w:val="num" w:pos="4320"/>
+        </w:tabs>
+        <w:ind w:left="4320" w:hanging="360"/>
+      </w:pPr>
+      <w:rPr>
+        <w:rFonts w:ascii="Wingdings" w:hAnsi="Wingdings" w:hint="default"/>
+        <w:sz w:val="20"/>
+      </w:rPr>
+    </w:lvl>
+    <w:lvl w:ilvl="6" w:tentative="1">
+      <w:start w:val="1"/>
+      <w:numFmt w:val="bullet"/>
+      <w:lvlText w:val=""/>
+      <w:lvlJc w:val="left"/>
+      <w:pPr>
+        <w:tabs>
+          <w:tab w:val="num" w:pos="5040"/>
+        </w:tabs>
+        <w:ind w:left="5040" w:hanging="360"/>
+      </w:pPr>
+      <w:rPr>
+        <w:rFonts w:ascii="Wingdings" w:hAnsi="Wingdings" w:hint="default"/>
+        <w:sz w:val="20"/>
+      </w:rPr>
+    </w:lvl>
+    <w:lvl w:ilvl="7" w:tentative="1">
+      <w:start w:val="1"/>
+      <w:numFmt w:val="bullet"/>
+      <w:lvlText w:val=""/>
+      <w:lvlJc w:val="left"/>
+      <w:pPr>
+        <w:tabs>
+          <w:tab w:val="num" w:pos="5760"/>
+        </w:tabs>
+        <w:ind w:left="5760" w:hanging="360"/>
+      </w:pPr>
+      <w:rPr>
+        <w:rFonts w:ascii="Wingdings" w:hAnsi="Wingdings" w:hint="default"/>
+        <w:sz w:val="20"/>
+      </w:rPr>
+    </w:lvl>
+    <w:lvl w:ilvl="8" w:tentative="1">
+      <w:start w:val="1"/>
+      <w:numFmt w:val="bullet"/>
+      <w:lvlText w:val=""/>
+      <w:lvlJc w:val="left"/>
+      <w:pPr>
+        <w:tabs>
+          <w:tab w:val="num" w:pos="6480"/>
+        </w:tabs>
+        <w:ind w:left="6480" w:hanging="360"/>
+      </w:pPr>
+      <w:rPr>
+        <w:rFonts w:ascii="Wingdings" w:hAnsi="Wingdings" w:hint="default"/>
+        <w:sz w:val="20"/>
+      </w:rPr>
+    </w:lvl>
+  </w:abstractNum>
+  <w:num w:numId="1" w16cid:durableId="761410036">
+    <w:abstractNumId w:val="0"/>
+  </w:num>
+  <w:num w:numId="2" w16cid:durableId="1500119894">
+    <w:abstractNumId w:val="1"/>
+  </w:num>
+</w:numbering>
 </file>
 
 <file path=word/styles.xml><?xml version="1.0" encoding="utf-8"?>
@@ -2774,6 +3157,41 @@
     <w:basedOn w:val="DefaultParagraphFont"/>
     <w:rsid w:val="00D551D8"/>
   </w:style>
+  <w:style w:type="character" w:styleId="Hyperlink">
+    <w:name w:val="Hyperlink"/>
+    <w:basedOn w:val="DefaultParagraphFont"/>
+    <w:uiPriority w:val="99"/>
+    <w:unhideWhenUsed/>
+    <w:rsid w:val="00DB479F"/>
+    <w:rPr>
+      <w:color w:val="0563C1" w:themeColor="hyperlink"/>
+      <w:u w:val="single"/>
+    </w:rPr>
+  </w:style>
+  <w:style w:type="character" w:styleId="UnresolvedMention">
+    <w:name w:val="Unresolved Mention"/>
+    <w:basedOn w:val="DefaultParagraphFont"/>
+    <w:uiPriority w:val="99"/>
+    <w:semiHidden/>
+    <w:unhideWhenUsed/>
+    <w:rsid w:val="00DB479F"/>
+    <w:rPr>
+      <w:color w:val="605E5C"/>
+      <w:shd w:val="clear" w:color="auto" w:fill="E1DFDD"/>
+    </w:rPr>
+  </w:style>
+  <w:style w:type="character" w:styleId="FollowedHyperlink">
+    <w:name w:val="FollowedHyperlink"/>
+    <w:basedOn w:val="DefaultParagraphFont"/>
+    <w:uiPriority w:val="99"/>
+    <w:semiHidden/>
+    <w:unhideWhenUsed/>
+    <w:rsid w:val="00DB479F"/>
+    <w:rPr>
+      <w:color w:val="954F72" w:themeColor="followedHyperlink"/>
+      <w:u w:val="single"/>
+    </w:rPr>
+  </w:style>
 </w:styles>
 </file>
 

</xml_diff>